<commit_message>
Addressed the review comments and updated the proper evidence and application
</commit_message>
<xml_diff>
--- a/Evidence/[Validation] BasePath when one deployment answers on several path prefixes.docx
+++ b/Evidence/[Validation] BasePath when one deployment answers on several path prefixes.docx
@@ -6,13 +6,8 @@
       <w:pPr>
         <w:pStyle w:val="Heading1"/>
       </w:pPr>
-      <w:proofErr w:type="spellStart"/>
       <w:r>
-        <w:t>BasePath</w:t>
-      </w:r>
-      <w:proofErr w:type="spellEnd"/>
-      <w:r>
-        <w:t xml:space="preserve"> when one deployment answers on several path prefixes</w:t>
+        <w:t>BasePath when one deployment answers on several path prefixes</w:t>
       </w:r>
     </w:p>
     <w:p>
@@ -49,15 +44,7 @@
           <w:b/>
           <w:bCs/>
         </w:rPr>
-        <w:t>Build tested</w:t>
-      </w:r>
-      <w:proofErr w:type="gramStart"/>
-      <w:r>
-        <w:rPr>
-          <w:b/>
-          <w:bCs/>
-        </w:rPr>
-        <w:t>:</w:t>
+        <w:t>Build tested:</w:t>
       </w:r>
       <w:r>
         <w:t xml:space="preserve"> </w:t>
@@ -66,11 +53,7 @@
         <w:tab/>
       </w:r>
       <w:r>
-        <w:t>11.0</w:t>
-      </w:r>
-      <w:proofErr w:type="gramEnd"/>
-      <w:r>
-        <w:t>.100-preview.7.26381.103</w:t>
+        <w:t>11.0.100-preview.7.26381.103</w:t>
       </w:r>
     </w:p>
     <w:p>
@@ -85,21 +68,11 @@
         <w:t xml:space="preserve"> </w:t>
       </w:r>
       <w:r>
-        <w:t xml:space="preserve">Static SSR, </w:t>
+        <w:t>Static SSR, InteractiveServer and InteractiveWebAssembly</w:t>
       </w:r>
-      <w:proofErr w:type="spellStart"/>
       <w:r>
-        <w:t>InteractiveServer</w:t>
+        <w:t xml:space="preserve"> with debug and Release mode.</w:t>
       </w:r>
-      <w:proofErr w:type="spellEnd"/>
-      <w:r>
-        <w:t xml:space="preserve"> and </w:t>
-      </w:r>
-      <w:proofErr w:type="spellStart"/>
-      <w:r>
-        <w:t>InteractiveWebAssembly</w:t>
-      </w:r>
-      <w:proofErr w:type="spellEnd"/>
     </w:p>
     <w:p>
       <w:r>
@@ -139,27 +112,23 @@
         <w:t xml:space="preserve">, </w:t>
       </w:r>
       <w:hyperlink r:id="rId10" w:history="1">
-        <w:proofErr w:type="spellStart"/>
         <w:r>
           <w:rPr>
             <w:rStyle w:val="Hyperlink"/>
           </w:rPr>
           <w:t>InteractiveServerApp</w:t>
         </w:r>
-        <w:proofErr w:type="spellEnd"/>
       </w:hyperlink>
       <w:r>
         <w:t xml:space="preserve"> and </w:t>
       </w:r>
       <w:hyperlink r:id="rId11" w:history="1">
-        <w:proofErr w:type="spellStart"/>
         <w:r>
           <w:rPr>
             <w:rStyle w:val="Hyperlink"/>
           </w:rPr>
           <w:t>InteractiveWebAssemblyApp</w:t>
         </w:r>
-        <w:proofErr w:type="spellEnd"/>
       </w:hyperlink>
     </w:p>
     <w:p>
@@ -182,39 +151,6 @@
       <w:r>
         <w:t>Also exercised:</w:t>
       </w:r>
-    </w:p>
-    <w:p>
-      <w:r>
-        <w:rPr>
-          <w:b/>
-          <w:bCs/>
-        </w:rPr>
-        <w:t>Published output:</w:t>
-      </w:r>
-      <w:r>
-        <w:t xml:space="preserve">  </w:t>
-      </w:r>
-      <w:hyperlink r:id="rId12" w:history="1">
-        <w:r>
-          <w:rPr>
-            <w:rStyle w:val="Hyperlink"/>
-          </w:rPr>
-          <w:t>Published output files</w:t>
-        </w:r>
-      </w:hyperlink>
-    </w:p>
-    <w:p>
-      <w:r>
-        <w:t xml:space="preserve">Published output video demo: </w:t>
-      </w:r>
-      <w:hyperlink r:id="rId13" w:history="1">
-        <w:r>
-          <w:rPr>
-            <w:rStyle w:val="Hyperlink"/>
-          </w:rPr>
-          <w:t>Published output video demo.mp4</w:t>
-        </w:r>
-      </w:hyperlink>
     </w:p>
     <w:p>
       <w:pPr>
@@ -240,21 +176,7 @@
         <w:rPr>
           <w:rFonts w:ascii="Aptos" w:eastAsia="Aptos" w:hAnsi="Aptos" w:cs="Aptos"/>
         </w:rPr>
-        <w:t xml:space="preserve">Used the </w:t>
-      </w:r>
-      <w:proofErr w:type="spellStart"/>
-      <w:r>
-        <w:rPr>
-          <w:rFonts w:ascii="Aptos" w:eastAsia="Aptos" w:hAnsi="Aptos" w:cs="Aptos"/>
-        </w:rPr>
-        <w:t>Yarp.ReverseProxy</w:t>
-      </w:r>
-      <w:proofErr w:type="spellEnd"/>
-      <w:r>
-        <w:rPr>
-          <w:rFonts w:ascii="Aptos" w:eastAsia="Aptos" w:hAnsi="Aptos" w:cs="Aptos"/>
-        </w:rPr>
-        <w:t xml:space="preserve"> package in the ASP NET core Empty project </w:t>
+        <w:t xml:space="preserve">Used the Yarp.ReverseProxy package in the ASP NET core Empty project </w:t>
       </w:r>
       <w:r>
         <w:rPr>
@@ -288,8 +210,7 @@
         <w:tab/>
         <w:t xml:space="preserve">Sample: </w:t>
       </w:r>
-      <w:hyperlink r:id="rId14" w:history="1">
-        <w:proofErr w:type="spellStart"/>
+      <w:hyperlink r:id="rId12" w:history="1">
         <w:r>
           <w:rPr>
             <w:rStyle w:val="Hyperlink"/>
@@ -297,102 +218,7 @@
           </w:rPr>
           <w:t>PrefixProxy</w:t>
         </w:r>
-        <w:proofErr w:type="spellEnd"/>
       </w:hyperlink>
-    </w:p>
-    <w:p>
-      <w:pPr>
-        <w:rPr>
-          <w:rFonts w:ascii="Aptos" w:eastAsia="Aptos" w:hAnsi="Aptos" w:cs="Aptos"/>
-          <w:b/>
-          <w:bCs/>
-        </w:rPr>
-      </w:pPr>
-      <w:r>
-        <w:rPr>
-          <w:rFonts w:ascii="Aptos" w:eastAsia="Aptos" w:hAnsi="Aptos" w:cs="Aptos"/>
-          <w:b/>
-          <w:bCs/>
-        </w:rPr>
-        <w:t>Container:</w:t>
-      </w:r>
-      <w:r>
-        <w:rPr>
-          <w:rFonts w:ascii="Aptos" w:eastAsia="Aptos" w:hAnsi="Aptos" w:cs="Aptos"/>
-          <w:b/>
-          <w:bCs/>
-        </w:rPr>
-        <w:t xml:space="preserve"> </w:t>
-      </w:r>
-    </w:p>
-    <w:p>
-      <w:pPr>
-        <w:rPr>
-          <w:rFonts w:ascii="Aptos" w:eastAsia="Aptos" w:hAnsi="Aptos" w:cs="Aptos"/>
-          <w:b/>
-          <w:bCs/>
-        </w:rPr>
-      </w:pPr>
-      <w:r>
-        <w:rPr>
-          <w:rFonts w:ascii="Aptos" w:eastAsia="Aptos" w:hAnsi="Aptos" w:cs="Aptos"/>
-          <w:b/>
-          <w:bCs/>
-        </w:rPr>
-        <w:tab/>
-        <w:t xml:space="preserve">Application: </w:t>
-      </w:r>
-      <w:hyperlink r:id="rId15" w:history="1">
-        <w:proofErr w:type="spellStart"/>
-        <w:r>
-          <w:rPr>
-            <w:rStyle w:val="Hyperlink"/>
-            <w:rFonts w:ascii="Aptos" w:eastAsia="Aptos" w:hAnsi="Aptos" w:cs="Aptos"/>
-            <w:b/>
-            <w:bCs/>
-          </w:rPr>
-          <w:t>BasePathWasmContainerApp</w:t>
-        </w:r>
-        <w:proofErr w:type="spellEnd"/>
-      </w:hyperlink>
-    </w:p>
-    <w:p>
-      <w:pPr>
-        <w:rPr>
-          <w:rFonts w:ascii="Aptos" w:eastAsia="Aptos" w:hAnsi="Aptos" w:cs="Aptos"/>
-        </w:rPr>
-      </w:pPr>
-      <w:r>
-        <w:rPr>
-          <w:rFonts w:ascii="Aptos" w:eastAsia="Aptos" w:hAnsi="Aptos" w:cs="Aptos"/>
-          <w:b/>
-          <w:bCs/>
-        </w:rPr>
-        <w:tab/>
-        <w:t xml:space="preserve">Demo: </w:t>
-      </w:r>
-      <w:r>
-        <w:rPr>
-          <w:rFonts w:ascii="Aptos" w:eastAsia="Aptos" w:hAnsi="Aptos" w:cs="Aptos"/>
-        </w:rPr>
-        <w:t xml:space="preserve"> </w:t>
-      </w:r>
-      <w:hyperlink r:id="rId16" w:history="1">
-        <w:r>
-          <w:rPr>
-            <w:rStyle w:val="Hyperlink"/>
-            <w:rFonts w:ascii="Aptos" w:eastAsia="Aptos" w:hAnsi="Aptos" w:cs="Aptos"/>
-          </w:rPr>
-          <w:t>BasePathContainerTestDemo.mp4</w:t>
-        </w:r>
-      </w:hyperlink>
-    </w:p>
-    <w:p>
-      <w:pPr>
-        <w:rPr>
-          <w:rFonts w:ascii="Aptos" w:eastAsia="Aptos" w:hAnsi="Aptos" w:cs="Aptos"/>
-        </w:rPr>
-      </w:pPr>
     </w:p>
     <w:p>
       <w:pPr>
@@ -402,7 +228,6 @@
         <w:t>Checks:</w:t>
       </w:r>
     </w:p>
-    <w:p/>
     <w:tbl>
       <w:tblPr>
         <w:tblStyle w:val="TableGrid"/>
@@ -411,8 +236,8 @@
         <w:tblLook w:val="04A0" w:firstRow="1" w:lastRow="0" w:firstColumn="1" w:lastColumn="0" w:noHBand="0" w:noVBand="1"/>
       </w:tblPr>
       <w:tblGrid>
-        <w:gridCol w:w="431"/>
-        <w:gridCol w:w="1994"/>
+        <w:gridCol w:w="535"/>
+        <w:gridCol w:w="1890"/>
         <w:gridCol w:w="1710"/>
         <w:gridCol w:w="2430"/>
         <w:gridCol w:w="2153"/>
@@ -421,7 +246,7 @@
       <w:tr>
         <w:tc>
           <w:tcPr>
-            <w:tcW w:w="431" w:type="dxa"/>
+            <w:tcW w:w="535" w:type="dxa"/>
           </w:tcPr>
           <w:p>
             <w:pPr>
@@ -430,23 +255,18 @@
                 <w:bCs/>
               </w:rPr>
             </w:pPr>
-            <w:proofErr w:type="spellStart"/>
-            <w:proofErr w:type="gramStart"/>
             <w:r>
               <w:rPr>
                 <w:b/>
                 <w:bCs/>
               </w:rPr>
-              <w:lastRenderedPageBreak/>
               <w:t>S.No</w:t>
             </w:r>
-            <w:proofErr w:type="spellEnd"/>
-            <w:proofErr w:type="gramEnd"/>
-          </w:p>
-        </w:tc>
-        <w:tc>
-          <w:tcPr>
-            <w:tcW w:w="1994" w:type="dxa"/>
+          </w:p>
+        </w:tc>
+        <w:tc>
+          <w:tcPr>
+            <w:tcW w:w="1890" w:type="dxa"/>
           </w:tcPr>
           <w:p>
             <w:pPr>
@@ -520,17 +340,8 @@
                 <w:b/>
                 <w:bCs/>
               </w:rPr>
-              <w:t xml:space="preserve">Interactive </w:t>
-            </w:r>
-            <w:proofErr w:type="spellStart"/>
-            <w:r>
-              <w:rPr>
-                <w:b/>
-                <w:bCs/>
-              </w:rPr>
-              <w:t>WebAssembly</w:t>
-            </w:r>
-            <w:proofErr w:type="spellEnd"/>
+              <w:t>Interactive WebAssembly</w:t>
+            </w:r>
           </w:p>
         </w:tc>
         <w:tc>
@@ -557,7 +368,7 @@
       <w:tr>
         <w:tc>
           <w:tcPr>
-            <w:tcW w:w="431" w:type="dxa"/>
+            <w:tcW w:w="535" w:type="dxa"/>
           </w:tcPr>
           <w:p>
             <w:r>
@@ -567,21 +378,20 @@
         </w:tc>
         <w:tc>
           <w:tcPr>
-            <w:tcW w:w="1994" w:type="dxa"/>
-          </w:tcPr>
-          <w:p>
-            <w:r>
-              <w:t>Each prefix serves a working app: assets load, interactivity starts, and navigation stays inside that prefix.</w:t>
-            </w:r>
-          </w:p>
-          <w:p/>
+            <w:tcW w:w="1890" w:type="dxa"/>
+          </w:tcPr>
+          <w:p>
+            <w:r>
+              <w:t>Assets loads Alpha</w:t>
+            </w:r>
+          </w:p>
         </w:tc>
         <w:tc>
           <w:tcPr>
             <w:tcW w:w="1710" w:type="dxa"/>
           </w:tcPr>
           <w:p>
-            <w:hyperlink r:id="rId17" w:history="1">
+            <w:hyperlink r:id="rId13" w:history="1">
               <w:r>
                 <w:rPr>
                   <w:rStyle w:val="Hyperlink"/>
@@ -589,9 +399,108 @@
                 <w:t>Alpha-assets-load.png</w:t>
               </w:r>
             </w:hyperlink>
-            <w:r>
-              <w:t xml:space="preserve"> | </w:t>
-            </w:r>
+          </w:p>
+        </w:tc>
+        <w:tc>
+          <w:tcPr>
+            <w:tcW w:w="2430" w:type="dxa"/>
+          </w:tcPr>
+          <w:p>
+            <w:hyperlink r:id="rId14" w:history="1">
+              <w:r>
+                <w:rPr>
+                  <w:rStyle w:val="Hyperlink"/>
+                </w:rPr>
+                <w:t>Alpha-assets-load.png</w:t>
+              </w:r>
+            </w:hyperlink>
+          </w:p>
+        </w:tc>
+        <w:tc>
+          <w:tcPr>
+            <w:tcW w:w="2153" w:type="dxa"/>
+          </w:tcPr>
+          <w:p>
+            <w:hyperlink r:id="rId15" w:history="1">
+              <w:r>
+                <w:rPr>
+                  <w:rStyle w:val="Hyperlink"/>
+                </w:rPr>
+                <w:t>Alpha-assets-load.png</w:t>
+              </w:r>
+            </w:hyperlink>
+          </w:p>
+        </w:tc>
+        <w:tc>
+          <w:tcPr>
+            <w:tcW w:w="1357" w:type="dxa"/>
+          </w:tcPr>
+          <w:p>
+            <w:r>
+              <w:t>Pass</w:t>
+            </w:r>
+          </w:p>
+        </w:tc>
+      </w:tr>
+      <w:tr>
+        <w:tc>
+          <w:tcPr>
+            <w:tcW w:w="535" w:type="dxa"/>
+          </w:tcPr>
+          <w:p>
+            <w:r>
+              <w:t>2</w:t>
+            </w:r>
+          </w:p>
+        </w:tc>
+        <w:tc>
+          <w:tcPr>
+            <w:tcW w:w="1890" w:type="dxa"/>
+          </w:tcPr>
+          <w:p>
+            <w:r>
+              <w:t xml:space="preserve">Assets loads </w:t>
+            </w:r>
+            <w:r>
+              <w:t>beta</w:t>
+            </w:r>
+          </w:p>
+        </w:tc>
+        <w:tc>
+          <w:tcPr>
+            <w:tcW w:w="1710" w:type="dxa"/>
+          </w:tcPr>
+          <w:p>
+            <w:hyperlink r:id="rId16" w:history="1">
+              <w:r>
+                <w:rPr>
+                  <w:rStyle w:val="Hyperlink"/>
+                </w:rPr>
+                <w:t>Beta-assets-load.png</w:t>
+              </w:r>
+            </w:hyperlink>
+          </w:p>
+        </w:tc>
+        <w:tc>
+          <w:tcPr>
+            <w:tcW w:w="2430" w:type="dxa"/>
+          </w:tcPr>
+          <w:p>
+            <w:hyperlink r:id="rId17" w:history="1">
+              <w:r>
+                <w:rPr>
+                  <w:rStyle w:val="Hyperlink"/>
+                </w:rPr>
+                <w:t>Beta-assets-load.png</w:t>
+              </w:r>
+            </w:hyperlink>
+          </w:p>
+        </w:tc>
+        <w:tc>
+          <w:tcPr>
+            <w:tcW w:w="2153" w:type="dxa"/>
+          </w:tcPr>
+          <w:p>
             <w:hyperlink r:id="rId18" w:history="1">
               <w:r>
                 <w:rPr>
@@ -602,6 +511,57 @@
             </w:hyperlink>
           </w:p>
           <w:p/>
+        </w:tc>
+        <w:tc>
+          <w:tcPr>
+            <w:tcW w:w="1357" w:type="dxa"/>
+          </w:tcPr>
+          <w:p>
+            <w:r>
+              <w:t>Pass</w:t>
+            </w:r>
+          </w:p>
+        </w:tc>
+      </w:tr>
+      <w:tr>
+        <w:tc>
+          <w:tcPr>
+            <w:tcW w:w="535" w:type="dxa"/>
+          </w:tcPr>
+          <w:p>
+            <w:r>
+              <w:t>3</w:t>
+            </w:r>
+          </w:p>
+        </w:tc>
+        <w:tc>
+          <w:tcPr>
+            <w:tcW w:w="1890" w:type="dxa"/>
+          </w:tcPr>
+          <w:p>
+            <w:r>
+              <w:t>interactivity starts</w:t>
+            </w:r>
+            <w:r>
+              <w:t xml:space="preserve"> alpha</w:t>
+            </w:r>
+          </w:p>
+        </w:tc>
+        <w:tc>
+          <w:tcPr>
+            <w:tcW w:w="1710" w:type="dxa"/>
+          </w:tcPr>
+          <w:p>
+            <w:r>
+              <w:t>Interactivity not supported</w:t>
+            </w:r>
+          </w:p>
+          <w:p/>
+        </w:tc>
+        <w:tc>
+          <w:tcPr>
+            <w:tcW w:w="2430" w:type="dxa"/>
+          </w:tcPr>
           <w:p>
             <w:hyperlink r:id="rId19" w:history="1">
               <w:r>
@@ -611,10 +571,85 @@
                 <w:t>Alpha-Interactivity-starts-test.png</w:t>
               </w:r>
             </w:hyperlink>
-            <w:r>
-              <w:t xml:space="preserve"> and </w:t>
-            </w:r>
+          </w:p>
+        </w:tc>
+        <w:tc>
+          <w:tcPr>
+            <w:tcW w:w="2153" w:type="dxa"/>
+          </w:tcPr>
+          <w:p>
             <w:hyperlink r:id="rId20" w:history="1">
+              <w:r>
+                <w:rPr>
+                  <w:rStyle w:val="Hyperlink"/>
+                </w:rPr>
+                <w:t>Alpha-Interactivity-starts-test.png</w:t>
+              </w:r>
+            </w:hyperlink>
+          </w:p>
+        </w:tc>
+        <w:tc>
+          <w:tcPr>
+            <w:tcW w:w="1357" w:type="dxa"/>
+          </w:tcPr>
+          <w:p>
+            <w:r>
+              <w:t>pass</w:t>
+            </w:r>
+          </w:p>
+        </w:tc>
+      </w:tr>
+      <w:tr>
+        <w:tc>
+          <w:tcPr>
+            <w:tcW w:w="535" w:type="dxa"/>
+          </w:tcPr>
+          <w:p>
+            <w:r>
+              <w:t>4</w:t>
+            </w:r>
+          </w:p>
+        </w:tc>
+        <w:tc>
+          <w:tcPr>
+            <w:tcW w:w="1890" w:type="dxa"/>
+          </w:tcPr>
+          <w:p>
+            <w:r>
+              <w:t>interactivity starts</w:t>
+            </w:r>
+            <w:r>
+              <w:t xml:space="preserve"> </w:t>
+            </w:r>
+            <w:r>
+              <w:t>Beta</w:t>
+            </w:r>
+          </w:p>
+        </w:tc>
+        <w:tc>
+          <w:tcPr>
+            <w:tcW w:w="1710" w:type="dxa"/>
+          </w:tcPr>
+          <w:p>
+            <w:r>
+              <w:t>Interactivity not supported</w:t>
+            </w:r>
+          </w:p>
+          <w:p>
+            <w:pPr>
+              <w:rPr>
+                <w:b/>
+                <w:bCs/>
+              </w:rPr>
+            </w:pPr>
+          </w:p>
+        </w:tc>
+        <w:tc>
+          <w:tcPr>
+            <w:tcW w:w="2430" w:type="dxa"/>
+          </w:tcPr>
+          <w:p>
+            <w:hyperlink r:id="rId21" w:history="1">
               <w:r>
                 <w:rPr>
                   <w:rStyle w:val="Hyperlink"/>
@@ -624,56 +659,13 @@
             </w:hyperlink>
           </w:p>
           <w:p/>
-          <w:p>
-            <w:hyperlink r:id="rId21" w:history="1">
-              <w:r>
-                <w:rPr>
-                  <w:rStyle w:val="Hyperlink"/>
-                </w:rPr>
-                <w:t>Navigation inside the prefix.png</w:t>
-              </w:r>
-            </w:hyperlink>
-          </w:p>
-        </w:tc>
-        <w:tc>
-          <w:tcPr>
-            <w:tcW w:w="2430" w:type="dxa"/>
+        </w:tc>
+        <w:tc>
+          <w:tcPr>
+            <w:tcW w:w="2153" w:type="dxa"/>
           </w:tcPr>
           <w:p>
             <w:hyperlink r:id="rId22" w:history="1">
-              <w:r>
-                <w:rPr>
-                  <w:rStyle w:val="Hyperlink"/>
-                </w:rPr>
-                <w:t>Alpha-assets-load.png</w:t>
-              </w:r>
-            </w:hyperlink>
-            <w:r>
-              <w:t xml:space="preserve"> and </w:t>
-            </w:r>
-            <w:hyperlink r:id="rId23" w:history="1">
-              <w:r>
-                <w:rPr>
-                  <w:rStyle w:val="Hyperlink"/>
-                </w:rPr>
-                <w:t>Beta-assets-load.png</w:t>
-              </w:r>
-            </w:hyperlink>
-          </w:p>
-          <w:p/>
-          <w:p>
-            <w:hyperlink r:id="rId24" w:history="1">
-              <w:r>
-                <w:rPr>
-                  <w:rStyle w:val="Hyperlink"/>
-                </w:rPr>
-                <w:t>Alpha-Interactivity-starts-test.png</w:t>
-              </w:r>
-            </w:hyperlink>
-            <w:r>
-              <w:t xml:space="preserve"> and </w:t>
-            </w:r>
-            <w:hyperlink r:id="rId25" w:history="1">
               <w:r>
                 <w:rPr>
                   <w:rStyle w:val="Hyperlink"/>
@@ -682,102 +674,29 @@
               </w:r>
             </w:hyperlink>
           </w:p>
+        </w:tc>
+        <w:tc>
+          <w:tcPr>
+            <w:tcW w:w="1357" w:type="dxa"/>
+          </w:tcPr>
           <w:p/>
-          <w:p>
-            <w:hyperlink r:id="rId26" w:history="1">
-              <w:r>
-                <w:rPr>
-                  <w:rStyle w:val="Hyperlink"/>
-                </w:rPr>
-                <w:t>Navigation inside the prefix.png</w:t>
-              </w:r>
-            </w:hyperlink>
-          </w:p>
-        </w:tc>
-        <w:tc>
-          <w:tcPr>
-            <w:tcW w:w="2153" w:type="dxa"/>
-          </w:tcPr>
-          <w:p>
-            <w:hyperlink r:id="rId27" w:history="1">
-              <w:r>
-                <w:rPr>
-                  <w:rStyle w:val="Hyperlink"/>
-                </w:rPr>
-                <w:t>Alpha-assets-load.png</w:t>
-              </w:r>
-            </w:hyperlink>
-            <w:r>
-              <w:t xml:space="preserve"> and </w:t>
-            </w:r>
-            <w:hyperlink r:id="rId28" w:history="1">
-              <w:r>
-                <w:rPr>
-                  <w:rStyle w:val="Hyperlink"/>
-                </w:rPr>
-                <w:t>Beta-assets-load.png</w:t>
-              </w:r>
-            </w:hyperlink>
-          </w:p>
-          <w:p/>
-          <w:p>
-            <w:hyperlink r:id="rId29" w:history="1">
-              <w:r>
-                <w:rPr>
-                  <w:rStyle w:val="Hyperlink"/>
-                </w:rPr>
-                <w:t>Alpha-Interactivity-starts-test.png</w:t>
-              </w:r>
-            </w:hyperlink>
-            <w:r>
-              <w:t xml:space="preserve"> and </w:t>
-            </w:r>
-            <w:hyperlink r:id="rId30" w:history="1">
-              <w:r>
-                <w:rPr>
-                  <w:rStyle w:val="Hyperlink"/>
-                </w:rPr>
-                <w:t>Beta-Interactivity-starts-test.png</w:t>
-              </w:r>
-            </w:hyperlink>
-          </w:p>
-          <w:p/>
-          <w:p>
-            <w:hyperlink r:id="rId31" w:history="1">
-              <w:r>
-                <w:rPr>
-                  <w:rStyle w:val="Hyperlink"/>
-                </w:rPr>
-                <w:t>Navigation inside the prefix.png</w:t>
-              </w:r>
-            </w:hyperlink>
-          </w:p>
-        </w:tc>
-        <w:tc>
-          <w:tcPr>
-            <w:tcW w:w="1357" w:type="dxa"/>
-          </w:tcPr>
-          <w:p>
-            <w:r>
-              <w:t>Pass</w:t>
-            </w:r>
-          </w:p>
         </w:tc>
       </w:tr>
       <w:tr>
         <w:tc>
           <w:tcPr>
-            <w:tcW w:w="431" w:type="dxa"/>
-          </w:tcPr>
-          <w:p>
-            <w:r>
-              <w:t>2</w:t>
-            </w:r>
-          </w:p>
-        </w:tc>
-        <w:tc>
-          <w:tcPr>
-            <w:tcW w:w="1994" w:type="dxa"/>
+            <w:tcW w:w="535" w:type="dxa"/>
+          </w:tcPr>
+          <w:p>
+            <w:r>
+              <w:lastRenderedPageBreak/>
+              <w:t>5</w:t>
+            </w:r>
+          </w:p>
+        </w:tc>
+        <w:tc>
+          <w:tcPr>
+            <w:tcW w:w="1890" w:type="dxa"/>
           </w:tcPr>
           <w:p>
             <w:r>
@@ -791,7 +710,7 @@
             <w:tcW w:w="1710" w:type="dxa"/>
           </w:tcPr>
           <w:p>
-            <w:hyperlink r:id="rId32" w:history="1">
+            <w:hyperlink r:id="rId23" w:history="1">
               <w:r>
                 <w:rPr>
                   <w:rStyle w:val="Hyperlink"/>
@@ -806,7 +725,7 @@
             <w:tcW w:w="2430" w:type="dxa"/>
           </w:tcPr>
           <w:p>
-            <w:hyperlink r:id="rId33" w:history="1">
+            <w:hyperlink r:id="rId24" w:history="1">
               <w:r>
                 <w:rPr>
                   <w:rStyle w:val="Hyperlink"/>
@@ -821,7 +740,7 @@
             <w:tcW w:w="2153" w:type="dxa"/>
           </w:tcPr>
           <w:p>
-            <w:hyperlink r:id="rId34" w:history="1">
+            <w:hyperlink r:id="rId25" w:history="1">
               <w:r>
                 <w:rPr>
                   <w:rStyle w:val="Hyperlink"/>
@@ -845,17 +764,17 @@
       <w:tr>
         <w:tc>
           <w:tcPr>
-            <w:tcW w:w="431" w:type="dxa"/>
-          </w:tcPr>
-          <w:p>
-            <w:r>
-              <w:t>3</w:t>
-            </w:r>
-          </w:p>
-        </w:tc>
-        <w:tc>
-          <w:tcPr>
-            <w:tcW w:w="1994" w:type="dxa"/>
+            <w:tcW w:w="535" w:type="dxa"/>
+          </w:tcPr>
+          <w:p>
+            <w:r>
+              <w:t>6</w:t>
+            </w:r>
+          </w:p>
+        </w:tc>
+        <w:tc>
+          <w:tcPr>
+            <w:tcW w:w="1890" w:type="dxa"/>
           </w:tcPr>
           <w:p>
             <w:r>
@@ -869,7 +788,7 @@
             <w:tcW w:w="1710" w:type="dxa"/>
           </w:tcPr>
           <w:p>
-            <w:hyperlink r:id="rId35" w:history="1">
+            <w:hyperlink r:id="rId26" w:history="1">
               <w:r>
                 <w:rPr>
                   <w:rStyle w:val="Hyperlink"/>
@@ -884,7 +803,7 @@
             <w:tcW w:w="2430" w:type="dxa"/>
           </w:tcPr>
           <w:p>
-            <w:hyperlink r:id="rId36" w:history="1">
+            <w:hyperlink r:id="rId27" w:history="1">
               <w:r>
                 <w:rPr>
                   <w:rStyle w:val="Hyperlink"/>
@@ -899,7 +818,7 @@
             <w:tcW w:w="2153" w:type="dxa"/>
           </w:tcPr>
           <w:p>
-            <w:hyperlink r:id="rId37" w:history="1">
+            <w:hyperlink r:id="rId28" w:history="1">
               <w:r>
                 <w:rPr>
                   <w:rStyle w:val="Hyperlink"/>
@@ -923,31 +842,47 @@
       <w:tr>
         <w:tc>
           <w:tcPr>
-            <w:tcW w:w="431" w:type="dxa"/>
-          </w:tcPr>
-          <w:p>
-            <w:r>
-              <w:t>4</w:t>
-            </w:r>
-          </w:p>
-        </w:tc>
-        <w:tc>
-          <w:tcPr>
-            <w:tcW w:w="1994" w:type="dxa"/>
+            <w:tcW w:w="535" w:type="dxa"/>
+          </w:tcPr>
+          <w:p>
+            <w:r>
+              <w:t>7</w:t>
+            </w:r>
+          </w:p>
+        </w:tc>
+        <w:tc>
+          <w:tcPr>
+            <w:tcW w:w="1890" w:type="dxa"/>
           </w:tcPr>
           <w:p>
             <w:r>
               <w:t>A form submitted through one prefix posts back through that same prefix.</w:t>
             </w:r>
-          </w:p>
-          <w:p/>
+            <w:r>
+              <w:t xml:space="preserve"> (</w:t>
+            </w:r>
+            <w:r>
+              <w:rPr>
+                <w:b/>
+                <w:bCs/>
+              </w:rPr>
+              <w:t>Alpha</w:t>
+            </w:r>
+            <w:r>
+              <w:rPr>
+                <w:b/>
+                <w:bCs/>
+              </w:rPr>
+              <w:t>)</w:t>
+            </w:r>
+          </w:p>
         </w:tc>
         <w:tc>
           <w:tcPr>
             <w:tcW w:w="1710" w:type="dxa"/>
           </w:tcPr>
           <w:p>
-            <w:hyperlink r:id="rId38" w:history="1">
+            <w:hyperlink r:id="rId29" w:history="1">
               <w:r>
                 <w:rPr>
                   <w:rStyle w:val="Hyperlink"/>
@@ -955,10 +890,86 @@
                 <w:t>Alpha-Form-Submit-Test.png</w:t>
               </w:r>
             </w:hyperlink>
-            <w:r>
-              <w:t xml:space="preserve"> and </w:t>
-            </w:r>
-            <w:hyperlink r:id="rId39" w:history="1">
+          </w:p>
+        </w:tc>
+        <w:tc>
+          <w:tcPr>
+            <w:tcW w:w="2430" w:type="dxa"/>
+          </w:tcPr>
+          <w:p>
+            <w:hyperlink r:id="rId30" w:history="1">
+              <w:r>
+                <w:rPr>
+                  <w:rStyle w:val="Hyperlink"/>
+                </w:rPr>
+                <w:t>Alpha-Form-Submit-Test.png</w:t>
+              </w:r>
+            </w:hyperlink>
+          </w:p>
+        </w:tc>
+        <w:tc>
+          <w:tcPr>
+            <w:tcW w:w="2153" w:type="dxa"/>
+          </w:tcPr>
+          <w:p>
+            <w:hyperlink r:id="rId31" w:history="1">
+              <w:r>
+                <w:rPr>
+                  <w:rStyle w:val="Hyperlink"/>
+                </w:rPr>
+                <w:t>Alpha-Form-Submit-Test.png</w:t>
+              </w:r>
+            </w:hyperlink>
+          </w:p>
+        </w:tc>
+        <w:tc>
+          <w:tcPr>
+            <w:tcW w:w="1357" w:type="dxa"/>
+          </w:tcPr>
+          <w:p>
+            <w:r>
+              <w:t>Pass</w:t>
+            </w:r>
+          </w:p>
+        </w:tc>
+      </w:tr>
+      <w:tr>
+        <w:tc>
+          <w:tcPr>
+            <w:tcW w:w="535" w:type="dxa"/>
+          </w:tcPr>
+          <w:p>
+            <w:r>
+              <w:t>8</w:t>
+            </w:r>
+          </w:p>
+        </w:tc>
+        <w:tc>
+          <w:tcPr>
+            <w:tcW w:w="1890" w:type="dxa"/>
+          </w:tcPr>
+          <w:p>
+            <w:r>
+              <w:t>A form submitted through one prefix posts back through that same prefix.</w:t>
+            </w:r>
+            <w:r>
+              <w:t xml:space="preserve"> </w:t>
+            </w:r>
+            <w:r>
+              <w:rPr>
+                <w:b/>
+                <w:bCs/>
+              </w:rPr>
+              <w:t>(Beta)</w:t>
+            </w:r>
+          </w:p>
+        </w:tc>
+        <w:tc>
+          <w:tcPr>
+            <w:tcW w:w="1710" w:type="dxa"/>
+          </w:tcPr>
+          <w:p>
+            <w:hyperlink r:id="rId32" w:history="1">
               <w:r>
                 <w:rPr>
                   <w:rStyle w:val="Hyperlink"/>
@@ -973,18 +984,7 @@
             <w:tcW w:w="2430" w:type="dxa"/>
           </w:tcPr>
           <w:p>
-            <w:hyperlink r:id="rId40" w:history="1">
-              <w:r>
-                <w:rPr>
-                  <w:rStyle w:val="Hyperlink"/>
-                </w:rPr>
-                <w:t>Alpha-Form-Submit-Test.png</w:t>
-              </w:r>
-            </w:hyperlink>
-            <w:r>
-              <w:t xml:space="preserve"> and </w:t>
-            </w:r>
-            <w:hyperlink r:id="rId41" w:history="1">
+            <w:hyperlink r:id="rId33" w:history="1">
               <w:r>
                 <w:rPr>
                   <w:rStyle w:val="Hyperlink"/>
@@ -999,18 +999,7 @@
             <w:tcW w:w="2153" w:type="dxa"/>
           </w:tcPr>
           <w:p>
-            <w:hyperlink r:id="rId42" w:history="1">
-              <w:r>
-                <w:rPr>
-                  <w:rStyle w:val="Hyperlink"/>
-                </w:rPr>
-                <w:t>Alpha-Form-Submit-Test.png</w:t>
-              </w:r>
-            </w:hyperlink>
-            <w:r>
-              <w:t xml:space="preserve"> and </w:t>
-            </w:r>
-            <w:hyperlink r:id="rId43" w:history="1">
+            <w:hyperlink r:id="rId34" w:history="1">
               <w:r>
                 <w:rPr>
                   <w:rStyle w:val="Hyperlink"/>
@@ -1026,7 +1015,7 @@
           </w:tcPr>
           <w:p>
             <w:r>
-              <w:t>Pass</w:t>
+              <w:t>pass</w:t>
             </w:r>
           </w:p>
         </w:tc>
@@ -1034,30 +1023,21 @@
       <w:tr>
         <w:tc>
           <w:tcPr>
-            <w:tcW w:w="431" w:type="dxa"/>
-          </w:tcPr>
-          <w:p>
-            <w:r>
-              <w:lastRenderedPageBreak/>
-              <w:t>5</w:t>
-            </w:r>
-          </w:p>
-        </w:tc>
-        <w:tc>
-          <w:tcPr>
-            <w:tcW w:w="1994" w:type="dxa"/>
-          </w:tcPr>
-          <w:p>
-            <w:r>
-              <w:t xml:space="preserve">Adding a prefix requires no source change and no </w:t>
-            </w:r>
-            <w:proofErr w:type="gramStart"/>
-            <w:r>
-              <w:t>rebuild</w:t>
-            </w:r>
-            <w:proofErr w:type="gramEnd"/>
-            <w:r>
-              <w:t>.</w:t>
+            <w:tcW w:w="535" w:type="dxa"/>
+          </w:tcPr>
+          <w:p>
+            <w:r>
+              <w:t>9</w:t>
+            </w:r>
+          </w:p>
+        </w:tc>
+        <w:tc>
+          <w:tcPr>
+            <w:tcW w:w="1890" w:type="dxa"/>
+          </w:tcPr>
+          <w:p>
+            <w:r>
+              <w:t>Adding a prefix requires no source change and no rebuild.</w:t>
             </w:r>
           </w:p>
           <w:p/>
@@ -1067,7 +1047,7 @@
             <w:tcW w:w="1710" w:type="dxa"/>
           </w:tcPr>
           <w:p>
-            <w:hyperlink r:id="rId44" w:history="1">
+            <w:hyperlink r:id="rId35" w:history="1">
               <w:r>
                 <w:rPr>
                   <w:rStyle w:val="Hyperlink"/>
@@ -1082,7 +1062,7 @@
             <w:tcW w:w="2430" w:type="dxa"/>
           </w:tcPr>
           <w:p>
-            <w:hyperlink r:id="rId45" w:history="1">
+            <w:hyperlink r:id="rId36" w:history="1">
               <w:r>
                 <w:rPr>
                   <w:rStyle w:val="Hyperlink"/>
@@ -1097,7 +1077,7 @@
             <w:tcW w:w="2153" w:type="dxa"/>
           </w:tcPr>
           <w:p>
-            <w:hyperlink r:id="rId46" w:history="1">
+            <w:hyperlink r:id="rId37" w:history="1">
               <w:r>
                 <w:rPr>
                   <w:rStyle w:val="Hyperlink"/>
@@ -1121,22 +1101,38 @@
       <w:tr>
         <w:tc>
           <w:tcPr>
-            <w:tcW w:w="431" w:type="dxa"/>
-          </w:tcPr>
-          <w:p>
-            <w:r>
-              <w:t>6</w:t>
-            </w:r>
-          </w:p>
-        </w:tc>
-        <w:tc>
-          <w:tcPr>
-            <w:tcW w:w="1994" w:type="dxa"/>
-          </w:tcPr>
-          <w:p>
+            <w:tcW w:w="535" w:type="dxa"/>
+          </w:tcPr>
+          <w:p>
+            <w:r>
+              <w:t>10</w:t>
+            </w:r>
+          </w:p>
+        </w:tc>
+        <w:tc>
+          <w:tcPr>
+            <w:tcW w:w="1890" w:type="dxa"/>
+          </w:tcPr>
+          <w:p>
+            <w:pPr>
+              <w:rPr>
+                <w:b/>
+                <w:bCs/>
+              </w:rPr>
+            </w:pPr>
             <w:r>
               <w:t>Reloading a nested page under each prefix.</w:t>
             </w:r>
+            <w:r>
+              <w:t xml:space="preserve"> </w:t>
+            </w:r>
+            <w:r>
+              <w:rPr>
+                <w:b/>
+                <w:bCs/>
+              </w:rPr>
+              <w:t>(Aplha)</w:t>
+            </w:r>
           </w:p>
           <w:p/>
         </w:tc>
@@ -1145,7 +1141,7 @@
             <w:tcW w:w="1710" w:type="dxa"/>
           </w:tcPr>
           <w:p>
-            <w:hyperlink r:id="rId47" w:history="1">
+            <w:hyperlink r:id="rId38" w:history="1">
               <w:r>
                 <w:rPr>
                   <w:rStyle w:val="Hyperlink"/>
@@ -1154,9 +1150,92 @@
               </w:r>
             </w:hyperlink>
             <w:r>
-              <w:t xml:space="preserve"> and </w:t>
-            </w:r>
-            <w:hyperlink r:id="rId48" w:history="1">
+              <w:t xml:space="preserve"> </w:t>
+            </w:r>
+          </w:p>
+        </w:tc>
+        <w:tc>
+          <w:tcPr>
+            <w:tcW w:w="2430" w:type="dxa"/>
+          </w:tcPr>
+          <w:p>
+            <w:hyperlink r:id="rId39" w:history="1">
+              <w:r>
+                <w:rPr>
+                  <w:rStyle w:val="Hyperlink"/>
+                </w:rPr>
+                <w:t>Alpha-Nested-Page test.png</w:t>
+              </w:r>
+            </w:hyperlink>
+          </w:p>
+        </w:tc>
+        <w:tc>
+          <w:tcPr>
+            <w:tcW w:w="2153" w:type="dxa"/>
+          </w:tcPr>
+          <w:p>
+            <w:hyperlink r:id="rId40" w:history="1">
+              <w:r>
+                <w:rPr>
+                  <w:rStyle w:val="Hyperlink"/>
+                </w:rPr>
+                <w:t>Alpha-Nested-Page test.png</w:t>
+              </w:r>
+            </w:hyperlink>
+          </w:p>
+        </w:tc>
+        <w:tc>
+          <w:tcPr>
+            <w:tcW w:w="1357" w:type="dxa"/>
+          </w:tcPr>
+          <w:p>
+            <w:r>
+              <w:t>Pass</w:t>
+            </w:r>
+          </w:p>
+        </w:tc>
+      </w:tr>
+      <w:tr>
+        <w:tc>
+          <w:tcPr>
+            <w:tcW w:w="535" w:type="dxa"/>
+          </w:tcPr>
+          <w:p>
+            <w:r>
+              <w:t>11</w:t>
+            </w:r>
+          </w:p>
+        </w:tc>
+        <w:tc>
+          <w:tcPr>
+            <w:tcW w:w="1890" w:type="dxa"/>
+          </w:tcPr>
+          <w:p>
+            <w:r>
+              <w:t xml:space="preserve">Reloading a nested page </w:t>
+            </w:r>
+            <w:r>
+              <w:lastRenderedPageBreak/>
+              <w:t>under each prefix.</w:t>
+            </w:r>
+            <w:r>
+              <w:t xml:space="preserve"> </w:t>
+            </w:r>
+            <w:r>
+              <w:rPr>
+                <w:b/>
+                <w:bCs/>
+              </w:rPr>
+              <w:t>(Beta)</w:t>
+            </w:r>
+          </w:p>
+        </w:tc>
+        <w:tc>
+          <w:tcPr>
+            <w:tcW w:w="1710" w:type="dxa"/>
+          </w:tcPr>
+          <w:p>
+            <w:hyperlink r:id="rId41" w:history="1">
               <w:r>
                 <w:rPr>
                   <w:rStyle w:val="Hyperlink"/>
@@ -1171,18 +1250,7 @@
             <w:tcW w:w="2430" w:type="dxa"/>
           </w:tcPr>
           <w:p>
-            <w:hyperlink r:id="rId49" w:history="1">
-              <w:r>
-                <w:rPr>
-                  <w:rStyle w:val="Hyperlink"/>
-                </w:rPr>
-                <w:t>Alpha-Nested-Page test.png</w:t>
-              </w:r>
-            </w:hyperlink>
-            <w:r>
-              <w:t xml:space="preserve"> and </w:t>
-            </w:r>
-            <w:hyperlink r:id="rId50" w:history="1">
+            <w:hyperlink r:id="rId42" w:history="1">
               <w:r>
                 <w:rPr>
                   <w:rStyle w:val="Hyperlink"/>
@@ -1197,18 +1265,7 @@
             <w:tcW w:w="2153" w:type="dxa"/>
           </w:tcPr>
           <w:p>
-            <w:hyperlink r:id="rId51" w:history="1">
-              <w:r>
-                <w:rPr>
-                  <w:rStyle w:val="Hyperlink"/>
-                </w:rPr>
-                <w:t>Alpha-Nested-Page test.png</w:t>
-              </w:r>
-            </w:hyperlink>
-            <w:r>
-              <w:t xml:space="preserve"> and </w:t>
-            </w:r>
-            <w:hyperlink r:id="rId52" w:history="1">
+            <w:hyperlink r:id="rId43" w:history="1">
               <w:r>
                 <w:rPr>
                   <w:rStyle w:val="Hyperlink"/>
@@ -1224,7 +1281,7 @@
           </w:tcPr>
           <w:p>
             <w:r>
-              <w:t>Pass</w:t>
+              <w:t>pass</w:t>
             </w:r>
           </w:p>
         </w:tc>
@@ -1232,17 +1289,17 @@
       <w:tr>
         <w:tc>
           <w:tcPr>
-            <w:tcW w:w="431" w:type="dxa"/>
-          </w:tcPr>
-          <w:p>
-            <w:r>
-              <w:t>7</w:t>
-            </w:r>
-          </w:p>
-        </w:tc>
-        <w:tc>
-          <w:tcPr>
-            <w:tcW w:w="1994" w:type="dxa"/>
+            <w:tcW w:w="535" w:type="dxa"/>
+          </w:tcPr>
+          <w:p>
+            <w:r>
+              <w:t>12</w:t>
+            </w:r>
+          </w:p>
+        </w:tc>
+        <w:tc>
+          <w:tcPr>
+            <w:tcW w:w="1890" w:type="dxa"/>
           </w:tcPr>
           <w:p>
             <w:r>
@@ -1256,7 +1313,7 @@
             <w:tcW w:w="1710" w:type="dxa"/>
           </w:tcPr>
           <w:p>
-            <w:hyperlink r:id="rId53" w:history="1">
+            <w:hyperlink r:id="rId44" w:history="1">
               <w:r>
                 <w:rPr>
                   <w:rStyle w:val="Hyperlink"/>
@@ -1271,7 +1328,7 @@
             <w:tcW w:w="2430" w:type="dxa"/>
           </w:tcPr>
           <w:p>
-            <w:hyperlink r:id="rId54" w:history="1">
+            <w:hyperlink r:id="rId45" w:history="1">
               <w:r>
                 <w:rPr>
                   <w:rStyle w:val="Hyperlink"/>
@@ -1286,7 +1343,7 @@
             <w:tcW w:w="2153" w:type="dxa"/>
           </w:tcPr>
           <w:p>
-            <w:hyperlink r:id="rId55" w:history="1">
+            <w:hyperlink r:id="rId46" w:history="1">
               <w:r>
                 <w:rPr>
                   <w:rStyle w:val="Hyperlink"/>
@@ -1307,44 +1364,317 @@
           </w:p>
         </w:tc>
       </w:tr>
+      <w:tr>
+        <w:tc>
+          <w:tcPr>
+            <w:tcW w:w="535" w:type="dxa"/>
+          </w:tcPr>
+          <w:p>
+            <w:r>
+              <w:t>13</w:t>
+            </w:r>
+          </w:p>
+        </w:tc>
+        <w:tc>
+          <w:tcPr>
+            <w:tcW w:w="1890" w:type="dxa"/>
+          </w:tcPr>
+          <w:p>
+            <w:r>
+              <w:t>Removed ForwardHeader configuration</w:t>
+            </w:r>
+          </w:p>
+        </w:tc>
+        <w:tc>
+          <w:tcPr>
+            <w:tcW w:w="1710" w:type="dxa"/>
+          </w:tcPr>
+          <w:p>
+            <w:hyperlink r:id="rId47" w:history="1">
+              <w:r>
+                <w:rPr>
+                  <w:rStyle w:val="Hyperlink"/>
+                </w:rPr>
+                <w:t>Remove ForwardHeader configuration.zip</w:t>
+              </w:r>
+            </w:hyperlink>
+          </w:p>
+        </w:tc>
+        <w:tc>
+          <w:tcPr>
+            <w:tcW w:w="2430" w:type="dxa"/>
+          </w:tcPr>
+          <w:p>
+            <w:hyperlink r:id="rId48" w:history="1">
+              <w:r>
+                <w:rPr>
+                  <w:rStyle w:val="Hyperlink"/>
+                </w:rPr>
+                <w:t>Removing forwarded configuration.mp4</w:t>
+              </w:r>
+            </w:hyperlink>
+          </w:p>
+        </w:tc>
+        <w:tc>
+          <w:tcPr>
+            <w:tcW w:w="2153" w:type="dxa"/>
+          </w:tcPr>
+          <w:p>
+            <w:hyperlink r:id="rId49" w:history="1">
+              <w:r>
+                <w:rPr>
+                  <w:rStyle w:val="Hyperlink"/>
+                </w:rPr>
+                <w:t>Remove ForwardHeader Configuration.zip</w:t>
+              </w:r>
+            </w:hyperlink>
+          </w:p>
+        </w:tc>
+        <w:tc>
+          <w:tcPr>
+            <w:tcW w:w="1357" w:type="dxa"/>
+          </w:tcPr>
+          <w:p>
+            <w:r>
+              <w:t>Pass</w:t>
+            </w:r>
+          </w:p>
+        </w:tc>
+      </w:tr>
+      <w:tr>
+        <w:tc>
+          <w:tcPr>
+            <w:tcW w:w="535" w:type="dxa"/>
+          </w:tcPr>
+          <w:p>
+            <w:r>
+              <w:t>14</w:t>
+            </w:r>
+          </w:p>
+        </w:tc>
+        <w:tc>
+          <w:tcPr>
+            <w:tcW w:w="1890" w:type="dxa"/>
+          </w:tcPr>
+          <w:p>
+            <w:r>
+              <w:t>Published output video demo</w:t>
+            </w:r>
+          </w:p>
+        </w:tc>
+        <w:tc>
+          <w:tcPr>
+            <w:tcW w:w="1710" w:type="dxa"/>
+          </w:tcPr>
+          <w:p>
+            <w:hyperlink r:id="rId50" w:history="1">
+              <w:r>
+                <w:rPr>
+                  <w:rStyle w:val="Hyperlink"/>
+                </w:rPr>
+                <w:t>SSR Published output video demo.mp4</w:t>
+              </w:r>
+            </w:hyperlink>
+          </w:p>
+        </w:tc>
+        <w:tc>
+          <w:tcPr>
+            <w:tcW w:w="2430" w:type="dxa"/>
+          </w:tcPr>
+          <w:p>
+            <w:hyperlink r:id="rId51" w:history="1">
+              <w:r>
+                <w:rPr>
+                  <w:rStyle w:val="Hyperlink"/>
+                </w:rPr>
+                <w:t>Interactivity Server Published output video demo.mp4</w:t>
+              </w:r>
+            </w:hyperlink>
+          </w:p>
+        </w:tc>
+        <w:tc>
+          <w:tcPr>
+            <w:tcW w:w="2153" w:type="dxa"/>
+          </w:tcPr>
+          <w:p>
+            <w:hyperlink r:id="rId52" w:history="1">
+              <w:r>
+                <w:rPr>
+                  <w:rStyle w:val="Hyperlink"/>
+                </w:rPr>
+                <w:t>WASM Published output video demo.mp4</w:t>
+              </w:r>
+            </w:hyperlink>
+          </w:p>
+        </w:tc>
+        <w:tc>
+          <w:tcPr>
+            <w:tcW w:w="1357" w:type="dxa"/>
+          </w:tcPr>
+          <w:p>
+            <w:r>
+              <w:t>pass</w:t>
+            </w:r>
+          </w:p>
+        </w:tc>
+      </w:tr>
+      <w:tr>
+        <w:tc>
+          <w:tcPr>
+            <w:tcW w:w="535" w:type="dxa"/>
+          </w:tcPr>
+          <w:p>
+            <w:r>
+              <w:t>15</w:t>
+            </w:r>
+          </w:p>
+        </w:tc>
+        <w:tc>
+          <w:tcPr>
+            <w:tcW w:w="1890" w:type="dxa"/>
+          </w:tcPr>
+          <w:p>
+            <w:r>
+              <w:t>Published output files</w:t>
+            </w:r>
+          </w:p>
+        </w:tc>
+        <w:tc>
+          <w:tcPr>
+            <w:tcW w:w="1710" w:type="dxa"/>
+          </w:tcPr>
+          <w:p>
+            <w:hyperlink r:id="rId53" w:history="1">
+              <w:r>
+                <w:rPr>
+                  <w:rStyle w:val="Hyperlink"/>
+                </w:rPr>
+                <w:t>Published output files for SSR application.zip</w:t>
+              </w:r>
+            </w:hyperlink>
+          </w:p>
+        </w:tc>
+        <w:tc>
+          <w:tcPr>
+            <w:tcW w:w="2430" w:type="dxa"/>
+          </w:tcPr>
+          <w:p>
+            <w:hyperlink r:id="rId54" w:history="1">
+              <w:r>
+                <w:rPr>
+                  <w:rStyle w:val="Hyperlink"/>
+                </w:rPr>
+                <w:t>InteractiveServer published output files.zip</w:t>
+              </w:r>
+            </w:hyperlink>
+          </w:p>
+        </w:tc>
+        <w:tc>
+          <w:tcPr>
+            <w:tcW w:w="2153" w:type="dxa"/>
+          </w:tcPr>
+          <w:p>
+            <w:hyperlink r:id="rId55" w:history="1">
+              <w:r>
+                <w:rPr>
+                  <w:rStyle w:val="Hyperlink"/>
+                </w:rPr>
+                <w:t>Published output files for WASM application.zip</w:t>
+              </w:r>
+            </w:hyperlink>
+          </w:p>
+        </w:tc>
+        <w:tc>
+          <w:tcPr>
+            <w:tcW w:w="1357" w:type="dxa"/>
+          </w:tcPr>
+          <w:p>
+            <w:r>
+              <w:t>Pass</w:t>
+            </w:r>
+          </w:p>
+        </w:tc>
+      </w:tr>
+      <w:tr>
+        <w:tc>
+          <w:tcPr>
+            <w:tcW w:w="535" w:type="dxa"/>
+          </w:tcPr>
+          <w:p>
+            <w:r>
+              <w:t>16</w:t>
+            </w:r>
+          </w:p>
+        </w:tc>
+        <w:tc>
+          <w:tcPr>
+            <w:tcW w:w="1890" w:type="dxa"/>
+          </w:tcPr>
+          <w:p>
+            <w:r>
+              <w:t>Container test</w:t>
+            </w:r>
+          </w:p>
+        </w:tc>
+        <w:tc>
+          <w:tcPr>
+            <w:tcW w:w="1710" w:type="dxa"/>
+          </w:tcPr>
+          <w:p>
+            <w:hyperlink r:id="rId56" w:history="1">
+              <w:r>
+                <w:rPr>
+                  <w:rStyle w:val="Hyperlink"/>
+                </w:rPr>
+                <w:t>SSR Container test demo.mp4</w:t>
+              </w:r>
+            </w:hyperlink>
+          </w:p>
+        </w:tc>
+        <w:tc>
+          <w:tcPr>
+            <w:tcW w:w="2430" w:type="dxa"/>
+          </w:tcPr>
+          <w:p>
+            <w:hyperlink r:id="rId57" w:history="1">
+              <w:r>
+                <w:rPr>
+                  <w:rStyle w:val="Hyperlink"/>
+                </w:rPr>
+                <w:t>Interactive Server Container Test Demo.mp4</w:t>
+              </w:r>
+            </w:hyperlink>
+          </w:p>
+        </w:tc>
+        <w:tc>
+          <w:tcPr>
+            <w:tcW w:w="2153" w:type="dxa"/>
+          </w:tcPr>
+          <w:p>
+            <w:hyperlink r:id="rId58" w:history="1">
+              <w:r>
+                <w:rPr>
+                  <w:rStyle w:val="Hyperlink"/>
+                </w:rPr>
+                <w:t>WASM Container Test Demo.mp4</w:t>
+              </w:r>
+            </w:hyperlink>
+          </w:p>
+        </w:tc>
+        <w:tc>
+          <w:tcPr>
+            <w:tcW w:w="1357" w:type="dxa"/>
+          </w:tcPr>
+          <w:p>
+            <w:r>
+              <w:t>Pass</w:t>
+            </w:r>
+          </w:p>
+        </w:tc>
+      </w:tr>
     </w:tbl>
     <w:p/>
-    <w:p>
-      <w:pPr>
-        <w:pStyle w:val="Heading3"/>
-      </w:pPr>
-      <w:r>
-        <w:t>Supportive</w:t>
-      </w:r>
-      <w:r>
-        <w:t xml:space="preserve"> evidence:</w:t>
-      </w:r>
-    </w:p>
-    <w:p>
-      <w:pPr>
-        <w:pStyle w:val="ListParagraph"/>
-        <w:numPr>
-          <w:ilvl w:val="0"/>
-          <w:numId w:val="17"/>
-        </w:numPr>
-      </w:pPr>
-      <w:r>
-        <w:t>After removing the forwarded-header configuration, the issue was successfully reproduced. The application did not correctly recognize the original request prefix, which led to incorrect URL generation, navigation behavior, and request routing. This reflects the expected behavior of a misconfigured deployment. Please refer to the demo video below for details.</w:t>
-      </w:r>
-    </w:p>
-    <w:p>
-      <w:r>
-        <w:t xml:space="preserve">Demo: </w:t>
-      </w:r>
-      <w:hyperlink r:id="rId56" w:history="1">
-        <w:r>
-          <w:rPr>
-            <w:rStyle w:val="Hyperlink"/>
-          </w:rPr>
-          <w:t>Removing forwarded configuration.mp4</w:t>
-        </w:r>
-      </w:hyperlink>
-    </w:p>
+    <w:p/>
     <w:p/>
     <w:p/>
     <w:p/>
@@ -4403,7 +4733,7 @@
   <w:style w:type="paragraph" w:default="1" w:styleId="Normal">
     <w:name w:val="Normal"/>
     <w:qFormat/>
-    <w:rsid w:val="00C56CF2"/>
+    <w:rsid w:val="006528D7"/>
   </w:style>
   <w:style w:type="paragraph" w:styleId="Heading1">
     <w:name w:val="heading 1"/>
@@ -5289,26 +5619,6 @@
 </file>
 
 <file path=customXml/item1.xml><?xml version="1.0" encoding="utf-8"?>
-<?mso-contentType ?>
-<FormTemplates xmlns="http://schemas.microsoft.com/sharepoint/v3/contenttype/forms">
-  <Display>DocumentLibraryForm</Display>
-  <Edit>DocumentLibraryForm</Edit>
-  <New>DocumentLibraryForm</New>
-</FormTemplates>
-</file>
-
-<file path=customXml/item2.xml><?xml version="1.0" encoding="utf-8"?>
-<p:properties xmlns:p="http://schemas.microsoft.com/office/2006/metadata/properties" xmlns:xsi="http://www.w3.org/2001/XMLSchema-instance" xmlns:pc="http://schemas.microsoft.com/office/infopath/2007/PartnerControls">
-  <documentManagement>
-    <TaxCatchAll xmlns="76301635-9239-4c63-b7c3-1485db98b457" xsi:nil="true"/>
-    <lcf76f155ced4ddcb4097134ff3c332f xmlns="caee7eb6-6dd4-45c1-9e8a-babddf390f35">
-      <Terms xmlns="http://schemas.microsoft.com/office/infopath/2007/PartnerControls"/>
-    </lcf76f155ced4ddcb4097134ff3c332f>
-  </documentManagement>
-</p:properties>
-</file>
-
-<file path=customXml/item3.xml><?xml version="1.0" encoding="utf-8"?>
 <ct:contentTypeSchema xmlns:ct="http://schemas.microsoft.com/office/2006/metadata/contentType" xmlns:ma="http://schemas.microsoft.com/office/2006/metadata/properties/metaAttributes" ct:_="" ma:_="" ma:contentTypeName="Document" ma:contentTypeID="0x0101002A361625FF487C4CA3EA5191E57B8C6D" ma:contentTypeVersion="10" ma:contentTypeDescription="Create a new document." ma:contentTypeScope="" ma:versionID="460a0a69af9734aeff2026eb69990c75">
   <xsd:schema xmlns:xsd="http://www.w3.org/2001/XMLSchema" xmlns:xs="http://www.w3.org/2001/XMLSchema" xmlns:p="http://schemas.microsoft.com/office/2006/metadata/properties" xmlns:ns2="caee7eb6-6dd4-45c1-9e8a-babddf390f35" xmlns:ns3="76301635-9239-4c63-b7c3-1485db98b457" targetNamespace="http://schemas.microsoft.com/office/2006/metadata/properties" ma:root="true" ma:fieldsID="df81253d5c86e2f07a84be4452311541" ns2:_="" ns3:_="">
     <xsd:import namespace="caee7eb6-6dd4-45c1-9e8a-babddf390f35"/>
@@ -5495,26 +5805,27 @@
 </ct:contentTypeSchema>
 </file>
 
-<file path=customXml/itemProps1.xml><?xml version="1.0" encoding="utf-8"?>
-<ds:datastoreItem xmlns:ds="http://schemas.openxmlformats.org/officeDocument/2006/customXml" ds:itemID="{A5A7F1FD-CE26-4C6E-80B9-F7C0DA317E9C}">
-  <ds:schemaRefs>
-    <ds:schemaRef ds:uri="http://schemas.microsoft.com/sharepoint/v3/contenttype/forms"/>
-  </ds:schemaRefs>
-</ds:datastoreItem>
+<file path=customXml/item2.xml><?xml version="1.0" encoding="utf-8"?>
+<?mso-contentType ?>
+<FormTemplates xmlns="http://schemas.microsoft.com/sharepoint/v3/contenttype/forms">
+  <Display>DocumentLibraryForm</Display>
+  <Edit>DocumentLibraryForm</Edit>
+  <New>DocumentLibraryForm</New>
+</FormTemplates>
 </file>
 
-<file path=customXml/itemProps2.xml><?xml version="1.0" encoding="utf-8"?>
-<ds:datastoreItem xmlns:ds="http://schemas.openxmlformats.org/officeDocument/2006/customXml" ds:itemID="{F5914588-E53C-4630-AC3C-554394DD0297}">
-  <ds:schemaRefs>
-    <ds:schemaRef ds:uri="http://schemas.microsoft.com/office/2006/metadata/properties"/>
-    <ds:schemaRef ds:uri="http://schemas.microsoft.com/office/infopath/2007/PartnerControls"/>
-    <ds:schemaRef ds:uri="76301635-9239-4c63-b7c3-1485db98b457"/>
-    <ds:schemaRef ds:uri="caee7eb6-6dd4-45c1-9e8a-babddf390f35"/>
-  </ds:schemaRefs>
-</ds:datastoreItem>
+<file path=customXml/item3.xml><?xml version="1.0" encoding="utf-8"?>
+<p:properties xmlns:p="http://schemas.microsoft.com/office/2006/metadata/properties" xmlns:xsi="http://www.w3.org/2001/XMLSchema-instance" xmlns:pc="http://schemas.microsoft.com/office/infopath/2007/PartnerControls">
+  <documentManagement>
+    <TaxCatchAll xmlns="76301635-9239-4c63-b7c3-1485db98b457" xsi:nil="true"/>
+    <lcf76f155ced4ddcb4097134ff3c332f xmlns="caee7eb6-6dd4-45c1-9e8a-babddf390f35">
+      <Terms xmlns="http://schemas.microsoft.com/office/infopath/2007/PartnerControls"/>
+    </lcf76f155ced4ddcb4097134ff3c332f>
+  </documentManagement>
+</p:properties>
 </file>
 
-<file path=customXml/itemProps3.xml><?xml version="1.0" encoding="utf-8"?>
+<file path=customXml/itemProps1.xml><?xml version="1.0" encoding="utf-8"?>
 <ds:datastoreItem xmlns:ds="http://schemas.openxmlformats.org/officeDocument/2006/customXml" ds:itemID="{CA84680B-EADD-4150-AEDF-CAA5335595FA}">
   <ds:schemaRefs>
     <ds:schemaRef ds:uri="http://schemas.microsoft.com/office/2006/metadata/contentType"/>
@@ -5531,4 +5842,23 @@
     <ds:schemaRef ds:uri="http://schemas.microsoft.com/internal/obd"/>
   </ds:schemaRefs>
 </ds:datastoreItem>
+</file>
+
+<file path=customXml/itemProps2.xml><?xml version="1.0" encoding="utf-8"?>
+<ds:datastoreItem xmlns:ds="http://schemas.openxmlformats.org/officeDocument/2006/customXml" ds:itemID="{A5A7F1FD-CE26-4C6E-80B9-F7C0DA317E9C}">
+  <ds:schemaRefs>
+    <ds:schemaRef ds:uri="http://schemas.microsoft.com/sharepoint/v3/contenttype/forms"/>
+  </ds:schemaRefs>
+</ds:datastoreItem>
+</file>
+
+<file path=customXml/itemProps3.xml><?xml version="1.0" encoding="utf-8"?>
+<ds:datastoreItem xmlns:ds="http://schemas.openxmlformats.org/officeDocument/2006/customXml" ds:itemID="{F5914588-E53C-4630-AC3C-554394DD0297}">
+  <ds:schemaRefs>
+    <ds:schemaRef ds:uri="http://schemas.microsoft.com/office/2006/metadata/properties"/>
+    <ds:schemaRef ds:uri="http://schemas.microsoft.com/office/infopath/2007/PartnerControls"/>
+    <ds:schemaRef ds:uri="76301635-9239-4c63-b7c3-1485db98b457"/>
+    <ds:schemaRef ds:uri="caee7eb6-6dd4-45c1-9e8a-babddf390f35"/>
+  </ds:schemaRefs>
+</ds:datastoreItem>
 </file>
</xml_diff>

<commit_message>
Add: observed browser URL vs app-reported PathBase mismatch, broken asset paths, actual errors/logs Add enhanced navigation form test with actual postback
</commit_message>
<xml_diff>
--- a/Evidence/[Validation] BasePath when one deployment answers on several path prefixes.docx
+++ b/Evidence/[Validation] BasePath when one deployment answers on several path prefixes.docx
@@ -6,8 +6,13 @@
       <w:pPr>
         <w:pStyle w:val="Heading1"/>
       </w:pPr>
+      <w:proofErr w:type="spellStart"/>
       <w:r>
-        <w:t>BasePath when one deployment answers on several path prefixes</w:t>
+        <w:t>BasePath</w:t>
+      </w:r>
+      <w:proofErr w:type="spellEnd"/>
+      <w:r>
+        <w:t xml:space="preserve"> when one deployment answers on several path prefixes</w:t>
       </w:r>
     </w:p>
     <w:p>
@@ -47,10 +52,10 @@
         <w:t>Build tested:</w:t>
       </w:r>
       <w:r>
-        <w:t xml:space="preserve"> </w:t>
+        <w:tab/>
       </w:r>
       <w:r>
-        <w:tab/>
+        <w:t xml:space="preserve">.NET </w:t>
       </w:r>
       <w:r>
         <w:t>11.0.100-preview.7.26381.103</w:t>
@@ -68,10 +73,114 @@
         <w:t xml:space="preserve"> </w:t>
       </w:r>
       <w:r>
-        <w:t>Static SSR, InteractiveServer and InteractiveWebAssembly</w:t>
+        <w:t xml:space="preserve">Static SSR, </w:t>
+      </w:r>
+      <w:proofErr w:type="spellStart"/>
+      <w:r>
+        <w:t>InteractiveServer</w:t>
+      </w:r>
+      <w:proofErr w:type="spellEnd"/>
+      <w:r>
+        <w:t xml:space="preserve"> and </w:t>
+      </w:r>
+      <w:proofErr w:type="spellStart"/>
+      <w:r>
+        <w:t>InteractiveWebAssembly</w:t>
+      </w:r>
+      <w:proofErr w:type="spellEnd"/>
+      <w:r>
+        <w:t xml:space="preserve"> with debug and Release mode.</w:t>
+      </w:r>
+    </w:p>
+    <w:p>
+      <w:pPr>
+        <w:rPr>
+          <w:b/>
+          <w:bCs/>
+        </w:rPr>
+      </w:pPr>
+      <w:r>
+        <w:rPr>
+          <w:b/>
+          <w:bCs/>
+        </w:rPr>
+        <w:t>OS</w:t>
       </w:r>
       <w:r>
-        <w:t xml:space="preserve"> with debug and Release mode.</w:t>
+        <w:rPr>
+          <w:b/>
+          <w:bCs/>
+        </w:rPr>
+        <w:t xml:space="preserve"> and version: </w:t>
+      </w:r>
+      <w:r>
+        <w:t>Windows</w:t>
+      </w:r>
+      <w:r>
+        <w:t xml:space="preserve"> -</w:t>
+      </w:r>
+      <w:r>
+        <w:t xml:space="preserve"> </w:t>
+      </w:r>
+      <w:r>
+        <w:t>26200.9106</w:t>
+      </w:r>
+    </w:p>
+    <w:p>
+      <w:pPr>
+        <w:rPr>
+          <w:b/>
+          <w:bCs/>
+        </w:rPr>
+      </w:pPr>
+      <w:r>
+        <w:rPr>
+          <w:b/>
+          <w:bCs/>
+        </w:rPr>
+        <w:t>Browser</w:t>
+      </w:r>
+      <w:r>
+        <w:rPr>
+          <w:b/>
+          <w:bCs/>
+        </w:rPr>
+        <w:t xml:space="preserve"> and version: </w:t>
+      </w:r>
+      <w:r>
+        <w:rPr>
+          <w:b/>
+          <w:bCs/>
+        </w:rPr>
+        <w:t> </w:t>
+      </w:r>
+      <w:r>
+        <w:t xml:space="preserve">Edge </w:t>
+      </w:r>
+      <w:r>
+        <w:t xml:space="preserve">- </w:t>
+      </w:r>
+      <w:r>
+        <w:t>152.0.4191.66</w:t>
+      </w:r>
+      <w:r>
+        <w:rPr>
+          <w:b/>
+          <w:bCs/>
+        </w:rPr>
+        <w:t> </w:t>
+      </w:r>
+      <w:r>
+        <w:t>and</w:t>
+      </w:r>
+      <w:r>
+        <w:t xml:space="preserve"> chrome-</w:t>
+      </w:r>
+      <w:r>
+        <w:t xml:space="preserve"> </w:t>
+      </w:r>
+      <w:r>
+        <w:t>152.0.7977.83</w:t>
       </w:r>
     </w:p>
     <w:p>
@@ -80,10 +189,10 @@
           <w:b/>
           <w:bCs/>
         </w:rPr>
-        <w:t>OS, Browser, IDE:</w:t>
+        <w:t>IDE:</w:t>
       </w:r>
       <w:r>
-        <w:t xml:space="preserve"> Windows, Edge and Chrome, Visual Studio</w:t>
+        <w:t xml:space="preserve"> Visual Studio</w:t>
       </w:r>
     </w:p>
     <w:p>
@@ -112,23 +221,27 @@
         <w:t xml:space="preserve">, </w:t>
       </w:r>
       <w:hyperlink r:id="rId10" w:history="1">
+        <w:proofErr w:type="spellStart"/>
         <w:r>
           <w:rPr>
             <w:rStyle w:val="Hyperlink"/>
           </w:rPr>
           <w:t>InteractiveServerApp</w:t>
         </w:r>
+        <w:proofErr w:type="spellEnd"/>
       </w:hyperlink>
       <w:r>
         <w:t xml:space="preserve"> and </w:t>
       </w:r>
       <w:hyperlink r:id="rId11" w:history="1">
+        <w:proofErr w:type="spellStart"/>
         <w:r>
           <w:rPr>
             <w:rStyle w:val="Hyperlink"/>
           </w:rPr>
           <w:t>InteractiveWebAssemblyApp</w:t>
         </w:r>
+        <w:proofErr w:type="spellEnd"/>
       </w:hyperlink>
     </w:p>
     <w:p>
@@ -176,7 +289,21 @@
         <w:rPr>
           <w:rFonts w:ascii="Aptos" w:eastAsia="Aptos" w:hAnsi="Aptos" w:cs="Aptos"/>
         </w:rPr>
-        <w:t xml:space="preserve">Used the Yarp.ReverseProxy package in the ASP NET core Empty project </w:t>
+        <w:t xml:space="preserve">Used the </w:t>
+      </w:r>
+      <w:proofErr w:type="spellStart"/>
+      <w:r>
+        <w:rPr>
+          <w:rFonts w:ascii="Aptos" w:eastAsia="Aptos" w:hAnsi="Aptos" w:cs="Aptos"/>
+        </w:rPr>
+        <w:t>Yarp.ReverseProxy</w:t>
+      </w:r>
+      <w:proofErr w:type="spellEnd"/>
+      <w:r>
+        <w:rPr>
+          <w:rFonts w:ascii="Aptos" w:eastAsia="Aptos" w:hAnsi="Aptos" w:cs="Aptos"/>
+        </w:rPr>
+        <w:t xml:space="preserve"> package in the ASP NET core Empty project </w:t>
       </w:r>
       <w:r>
         <w:rPr>
@@ -211,6 +338,7 @@
         <w:t xml:space="preserve">Sample: </w:t>
       </w:r>
       <w:hyperlink r:id="rId12" w:history="1">
+        <w:proofErr w:type="spellStart"/>
         <w:r>
           <w:rPr>
             <w:rStyle w:val="Hyperlink"/>
@@ -218,6 +346,7 @@
           </w:rPr>
           <w:t>PrefixProxy</w:t>
         </w:r>
+        <w:proofErr w:type="spellEnd"/>
       </w:hyperlink>
     </w:p>
     <w:p>
@@ -255,6 +384,7 @@
                 <w:bCs/>
               </w:rPr>
             </w:pPr>
+            <w:proofErr w:type="spellStart"/>
             <w:r>
               <w:rPr>
                 <w:b/>
@@ -262,6 +392,7 @@
               </w:rPr>
               <w:t>S.No</w:t>
             </w:r>
+            <w:proofErr w:type="spellEnd"/>
           </w:p>
         </w:tc>
         <w:tc>
@@ -340,8 +471,17 @@
                 <w:b/>
                 <w:bCs/>
               </w:rPr>
-              <w:t>Interactive WebAssembly</w:t>
-            </w:r>
+              <w:t xml:space="preserve">Interactive </w:t>
+            </w:r>
+            <w:proofErr w:type="spellStart"/>
+            <w:r>
+              <w:rPr>
+                <w:b/>
+                <w:bCs/>
+              </w:rPr>
+              <w:t>WebAssembly</w:t>
+            </w:r>
+            <w:proofErr w:type="spellEnd"/>
           </w:p>
         </w:tc>
         <w:tc>
@@ -459,10 +599,7 @@
           </w:tcPr>
           <w:p>
             <w:r>
-              <w:t xml:space="preserve">Assets loads </w:t>
-            </w:r>
-            <w:r>
-              <w:t>beta</w:t>
+              <w:t>Assets loads beta</w:t>
             </w:r>
           </w:p>
         </w:tc>
@@ -606,6 +743,7 @@
           </w:tcPr>
           <w:p>
             <w:r>
+              <w:lastRenderedPageBreak/>
               <w:t>4</w:t>
             </w:r>
           </w:p>
@@ -619,10 +757,7 @@
               <w:t>interactivity starts</w:t>
             </w:r>
             <w:r>
-              <w:t xml:space="preserve"> </w:t>
-            </w:r>
-            <w:r>
-              <w:t>Beta</w:t>
+              <w:t xml:space="preserve"> Beta</w:t>
             </w:r>
           </w:p>
         </w:tc>
@@ -679,7 +814,11 @@
           <w:tcPr>
             <w:tcW w:w="1357" w:type="dxa"/>
           </w:tcPr>
-          <w:p/>
+          <w:p>
+            <w:r>
+              <w:t>pass</w:t>
+            </w:r>
+          </w:p>
         </w:tc>
       </w:tr>
       <w:tr>
@@ -689,7 +828,97 @@
           </w:tcPr>
           <w:p>
             <w:r>
-              <w:lastRenderedPageBreak/>
+              <w:t>5</w:t>
+            </w:r>
+          </w:p>
+        </w:tc>
+        <w:tc>
+          <w:tcPr>
+            <w:tcW w:w="1890" w:type="dxa"/>
+          </w:tcPr>
+          <w:p>
+            <w:r>
+              <w:t> navigation stays inside that prefix</w:t>
+            </w:r>
+            <w:r>
+              <w:t xml:space="preserve"> alpha</w:t>
+            </w:r>
+          </w:p>
+        </w:tc>
+        <w:tc>
+          <w:tcPr>
+            <w:tcW w:w="1710" w:type="dxa"/>
+          </w:tcPr>
+          <w:p/>
+        </w:tc>
+        <w:tc>
+          <w:tcPr>
+            <w:tcW w:w="2430" w:type="dxa"/>
+          </w:tcPr>
+          <w:p/>
+        </w:tc>
+        <w:tc>
+          <w:tcPr>
+            <w:tcW w:w="2153" w:type="dxa"/>
+          </w:tcPr>
+          <w:p/>
+        </w:tc>
+        <w:tc>
+          <w:tcPr>
+            <w:tcW w:w="1357" w:type="dxa"/>
+          </w:tcPr>
+          <w:p/>
+        </w:tc>
+      </w:tr>
+      <w:tr>
+        <w:tc>
+          <w:tcPr>
+            <w:tcW w:w="535" w:type="dxa"/>
+          </w:tcPr>
+          <w:p>
+            <w:r>
+              <w:t>6</w:t>
+            </w:r>
+          </w:p>
+        </w:tc>
+        <w:tc>
+          <w:tcPr>
+            <w:tcW w:w="1890" w:type="dxa"/>
+          </w:tcPr>
+          <w:p/>
+        </w:tc>
+        <w:tc>
+          <w:tcPr>
+            <w:tcW w:w="1710" w:type="dxa"/>
+          </w:tcPr>
+          <w:p/>
+        </w:tc>
+        <w:tc>
+          <w:tcPr>
+            <w:tcW w:w="2430" w:type="dxa"/>
+          </w:tcPr>
+          <w:p/>
+        </w:tc>
+        <w:tc>
+          <w:tcPr>
+            <w:tcW w:w="2153" w:type="dxa"/>
+          </w:tcPr>
+          <w:p/>
+        </w:tc>
+        <w:tc>
+          <w:tcPr>
+            <w:tcW w:w="1357" w:type="dxa"/>
+          </w:tcPr>
+          <w:p/>
+        </w:tc>
+      </w:tr>
+      <w:tr>
+        <w:tc>
+          <w:tcPr>
+            <w:tcW w:w="535" w:type="dxa"/>
+          </w:tcPr>
+          <w:p>
+            <w:r>
               <w:t>5</w:t>
             </w:r>
           </w:p>
@@ -1105,6 +1334,7 @@
           </w:tcPr>
           <w:p>
             <w:r>
+              <w:lastRenderedPageBreak/>
               <w:t>10</w:t>
             </w:r>
           </w:p>
@@ -1131,7 +1361,23 @@
                 <w:b/>
                 <w:bCs/>
               </w:rPr>
-              <w:t>(Aplha)</w:t>
+              <w:t>(</w:t>
+            </w:r>
+            <w:proofErr w:type="spellStart"/>
+            <w:r>
+              <w:rPr>
+                <w:b/>
+                <w:bCs/>
+              </w:rPr>
+              <w:t>Aplha</w:t>
+            </w:r>
+            <w:proofErr w:type="spellEnd"/>
+            <w:r>
+              <w:rPr>
+                <w:b/>
+                <w:bCs/>
+              </w:rPr>
+              <w:t>)</w:t>
             </w:r>
           </w:p>
           <w:p/>
@@ -1212,11 +1458,7 @@
           </w:tcPr>
           <w:p>
             <w:r>
-              <w:t xml:space="preserve">Reloading a nested page </w:t>
-            </w:r>
-            <w:r>
-              <w:lastRenderedPageBreak/>
-              <w:t>under each prefix.</w:t>
+              <w:t>Reloading a nested page under each prefix.</w:t>
             </w:r>
             <w:r>
               <w:t xml:space="preserve"> </w:t>
@@ -1381,7 +1623,15 @@
           </w:tcPr>
           <w:p>
             <w:r>
-              <w:t>Removed ForwardHeader configuration</w:t>
+              <w:t xml:space="preserve">Removed </w:t>
+            </w:r>
+            <w:proofErr w:type="spellStart"/>
+            <w:r>
+              <w:t>ForwardHeader</w:t>
+            </w:r>
+            <w:proofErr w:type="spellEnd"/>
+            <w:r>
+              <w:t xml:space="preserve"> configuration</w:t>
             </w:r>
           </w:p>
         </w:tc>
@@ -1395,7 +1645,21 @@
                 <w:rPr>
                   <w:rStyle w:val="Hyperlink"/>
                 </w:rPr>
-                <w:t>Remove ForwardHeader configuration.zip</w:t>
+                <w:t xml:space="preserve">Remove </w:t>
+              </w:r>
+              <w:proofErr w:type="spellStart"/>
+              <w:r>
+                <w:rPr>
+                  <w:rStyle w:val="Hyperlink"/>
+                </w:rPr>
+                <w:t>ForwardHeader</w:t>
+              </w:r>
+              <w:proofErr w:type="spellEnd"/>
+              <w:r>
+                <w:rPr>
+                  <w:rStyle w:val="Hyperlink"/>
+                </w:rPr>
+                <w:t xml:space="preserve"> configuration.zip</w:t>
               </w:r>
             </w:hyperlink>
           </w:p>
@@ -1425,7 +1689,21 @@
                 <w:rPr>
                   <w:rStyle w:val="Hyperlink"/>
                 </w:rPr>
-                <w:t>Remove ForwardHeader Configuration.zip</w:t>
+                <w:t xml:space="preserve">Remove </w:t>
+              </w:r>
+              <w:proofErr w:type="spellStart"/>
+              <w:r>
+                <w:rPr>
+                  <w:rStyle w:val="Hyperlink"/>
+                </w:rPr>
+                <w:t>ForwardHeader</w:t>
+              </w:r>
+              <w:proofErr w:type="spellEnd"/>
+              <w:r>
+                <w:rPr>
+                  <w:rStyle w:val="Hyperlink"/>
+                </w:rPr>
+                <w:t xml:space="preserve"> Configuration.zip</w:t>
               </w:r>
             </w:hyperlink>
           </w:p>
@@ -1560,11 +1838,19 @@
           </w:tcPr>
           <w:p>
             <w:hyperlink r:id="rId54" w:history="1">
+              <w:proofErr w:type="spellStart"/>
               <w:r>
                 <w:rPr>
                   <w:rStyle w:val="Hyperlink"/>
                 </w:rPr>
-                <w:t>InteractiveServer published output files.zip</w:t>
+                <w:t>InteractiveServer</w:t>
+              </w:r>
+              <w:proofErr w:type="spellEnd"/>
+              <w:r>
+                <w:rPr>
+                  <w:rStyle w:val="Hyperlink"/>
+                </w:rPr>
+                <w:t xml:space="preserve"> published output files.zip</w:t>
               </w:r>
             </w:hyperlink>
           </w:p>
@@ -5619,6 +5905,17 @@
 </file>
 
 <file path=customXml/item1.xml><?xml version="1.0" encoding="utf-8"?>
+<p:properties xmlns:p="http://schemas.microsoft.com/office/2006/metadata/properties" xmlns:xsi="http://www.w3.org/2001/XMLSchema-instance" xmlns:pc="http://schemas.microsoft.com/office/infopath/2007/PartnerControls">
+  <documentManagement>
+    <TaxCatchAll xmlns="76301635-9239-4c63-b7c3-1485db98b457" xsi:nil="true"/>
+    <lcf76f155ced4ddcb4097134ff3c332f xmlns="caee7eb6-6dd4-45c1-9e8a-babddf390f35">
+      <Terms xmlns="http://schemas.microsoft.com/office/infopath/2007/PartnerControls"/>
+    </lcf76f155ced4ddcb4097134ff3c332f>
+  </documentManagement>
+</p:properties>
+</file>
+
+<file path=customXml/item2.xml><?xml version="1.0" encoding="utf-8"?>
 <ct:contentTypeSchema xmlns:ct="http://schemas.microsoft.com/office/2006/metadata/contentType" xmlns:ma="http://schemas.microsoft.com/office/2006/metadata/properties/metaAttributes" ct:_="" ma:_="" ma:contentTypeName="Document" ma:contentTypeID="0x0101002A361625FF487C4CA3EA5191E57B8C6D" ma:contentTypeVersion="10" ma:contentTypeDescription="Create a new document." ma:contentTypeScope="" ma:versionID="460a0a69af9734aeff2026eb69990c75">
   <xsd:schema xmlns:xsd="http://www.w3.org/2001/XMLSchema" xmlns:xs="http://www.w3.org/2001/XMLSchema" xmlns:p="http://schemas.microsoft.com/office/2006/metadata/properties" xmlns:ns2="caee7eb6-6dd4-45c1-9e8a-babddf390f35" xmlns:ns3="76301635-9239-4c63-b7c3-1485db98b457" targetNamespace="http://schemas.microsoft.com/office/2006/metadata/properties" ma:root="true" ma:fieldsID="df81253d5c86e2f07a84be4452311541" ns2:_="" ns3:_="">
     <xsd:import namespace="caee7eb6-6dd4-45c1-9e8a-babddf390f35"/>
@@ -5805,7 +6102,7 @@
 </ct:contentTypeSchema>
 </file>
 
-<file path=customXml/item2.xml><?xml version="1.0" encoding="utf-8"?>
+<file path=customXml/item3.xml><?xml version="1.0" encoding="utf-8"?>
 <?mso-contentType ?>
 <FormTemplates xmlns="http://schemas.microsoft.com/sharepoint/v3/contenttype/forms">
   <Display>DocumentLibraryForm</Display>
@@ -5814,18 +6111,18 @@
 </FormTemplates>
 </file>
 
-<file path=customXml/item3.xml><?xml version="1.0" encoding="utf-8"?>
-<p:properties xmlns:p="http://schemas.microsoft.com/office/2006/metadata/properties" xmlns:xsi="http://www.w3.org/2001/XMLSchema-instance" xmlns:pc="http://schemas.microsoft.com/office/infopath/2007/PartnerControls">
-  <documentManagement>
-    <TaxCatchAll xmlns="76301635-9239-4c63-b7c3-1485db98b457" xsi:nil="true"/>
-    <lcf76f155ced4ddcb4097134ff3c332f xmlns="caee7eb6-6dd4-45c1-9e8a-babddf390f35">
-      <Terms xmlns="http://schemas.microsoft.com/office/infopath/2007/PartnerControls"/>
-    </lcf76f155ced4ddcb4097134ff3c332f>
-  </documentManagement>
-</p:properties>
+<file path=customXml/itemProps1.xml><?xml version="1.0" encoding="utf-8"?>
+<ds:datastoreItem xmlns:ds="http://schemas.openxmlformats.org/officeDocument/2006/customXml" ds:itemID="{F5914588-E53C-4630-AC3C-554394DD0297}">
+  <ds:schemaRefs>
+    <ds:schemaRef ds:uri="http://schemas.microsoft.com/office/2006/metadata/properties"/>
+    <ds:schemaRef ds:uri="http://schemas.microsoft.com/office/infopath/2007/PartnerControls"/>
+    <ds:schemaRef ds:uri="76301635-9239-4c63-b7c3-1485db98b457"/>
+    <ds:schemaRef ds:uri="caee7eb6-6dd4-45c1-9e8a-babddf390f35"/>
+  </ds:schemaRefs>
+</ds:datastoreItem>
 </file>
 
-<file path=customXml/itemProps1.xml><?xml version="1.0" encoding="utf-8"?>
+<file path=customXml/itemProps2.xml><?xml version="1.0" encoding="utf-8"?>
 <ds:datastoreItem xmlns:ds="http://schemas.openxmlformats.org/officeDocument/2006/customXml" ds:itemID="{CA84680B-EADD-4150-AEDF-CAA5335595FA}">
   <ds:schemaRefs>
     <ds:schemaRef ds:uri="http://schemas.microsoft.com/office/2006/metadata/contentType"/>
@@ -5844,21 +6141,10 @@
 </ds:datastoreItem>
 </file>
 
-<file path=customXml/itemProps2.xml><?xml version="1.0" encoding="utf-8"?>
+<file path=customXml/itemProps3.xml><?xml version="1.0" encoding="utf-8"?>
 <ds:datastoreItem xmlns:ds="http://schemas.openxmlformats.org/officeDocument/2006/customXml" ds:itemID="{A5A7F1FD-CE26-4C6E-80B9-F7C0DA317E9C}">
   <ds:schemaRefs>
     <ds:schemaRef ds:uri="http://schemas.microsoft.com/sharepoint/v3/contenttype/forms"/>
   </ds:schemaRefs>
 </ds:datastoreItem>
-</file>
-
-<file path=customXml/itemProps3.xml><?xml version="1.0" encoding="utf-8"?>
-<ds:datastoreItem xmlns:ds="http://schemas.openxmlformats.org/officeDocument/2006/customXml" ds:itemID="{F5914588-E53C-4630-AC3C-554394DD0297}">
-  <ds:schemaRefs>
-    <ds:schemaRef ds:uri="http://schemas.microsoft.com/office/2006/metadata/properties"/>
-    <ds:schemaRef ds:uri="http://schemas.microsoft.com/office/infopath/2007/PartnerControls"/>
-    <ds:schemaRef ds:uri="76301635-9239-4c63-b7c3-1485db98b457"/>
-    <ds:schemaRef ds:uri="caee7eb6-6dd4-45c1-9e8a-babddf390f35"/>
-  </ds:schemaRefs>
-</ds:datastoreItem>
 </file>
</xml_diff>

<commit_message>
Addressed the review concerns
</commit_message>
<xml_diff>
--- a/Evidence/[Validation] BasePath when one deployment answers on several path prefixes.docx
+++ b/Evidence/[Validation] BasePath when one deployment answers on several path prefixes.docx
@@ -127,12 +127,6 @@
       </w:r>
     </w:p>
     <w:p>
-      <w:pPr>
-        <w:rPr>
-          <w:b/>
-          <w:bCs/>
-        </w:rPr>
-      </w:pPr>
       <w:r>
         <w:rPr>
           <w:b/>
@@ -155,32 +149,7 @@
         <w:t> </w:t>
       </w:r>
       <w:r>
-        <w:t xml:space="preserve">Edge </w:t>
-      </w:r>
-      <w:r>
-        <w:t xml:space="preserve">- </w:t>
-      </w:r>
-      <w:r>
-        <w:t>152.0.4191.66</w:t>
-      </w:r>
-      <w:r>
-        <w:rPr>
-          <w:b/>
-          <w:bCs/>
-        </w:rPr>
-        <w:t> </w:t>
-      </w:r>
-      <w:r>
-        <w:t>and</w:t>
-      </w:r>
-      <w:r>
-        <w:t xml:space="preserve"> chrome-</w:t>
-      </w:r>
-      <w:r>
-        <w:t xml:space="preserve"> </w:t>
-      </w:r>
-      <w:r>
-        <w:t>152.0.7977.83</w:t>
+        <w:t>Microsoft Edge `152.0.4191.66` and Google Chrome `152.0.7977.83`</w:t>
       </w:r>
     </w:p>
     <w:p>
@@ -253,7 +222,10 @@
         <w:t>Outcome:</w:t>
       </w:r>
       <w:r>
-        <w:t xml:space="preserve"> Working fine.</w:t>
+        <w:t xml:space="preserve"> </w:t>
+      </w:r>
+      <w:r>
+        <w:t>All tested scenarios worked as expected.</w:t>
       </w:r>
     </w:p>
     <w:p/>
@@ -269,6 +241,8 @@
       <w:pPr>
         <w:rPr>
           <w:rFonts w:ascii="Aptos" w:eastAsia="Aptos" w:hAnsi="Aptos" w:cs="Aptos"/>
+          <w:b/>
+          <w:bCs/>
         </w:rPr>
       </w:pPr>
       <w:r>
@@ -277,19 +251,28 @@
           <w:b/>
           <w:bCs/>
         </w:rPr>
-        <w:t>Reverse proxy:</w:t>
+        <w:t>Reverse prox</w:t>
       </w:r>
       <w:r>
         <w:rPr>
           <w:rFonts w:ascii="Aptos" w:eastAsia="Aptos" w:hAnsi="Aptos" w:cs="Aptos"/>
+          <w:b/>
+          <w:bCs/>
         </w:rPr>
-        <w:t xml:space="preserve"> </w:t>
+        <w:t xml:space="preserve">y: </w:t>
       </w:r>
+    </w:p>
+    <w:p>
+      <w:pPr>
+        <w:rPr>
+          <w:rFonts w:ascii="Aptos" w:eastAsia="Aptos" w:hAnsi="Aptos" w:cs="Aptos"/>
+        </w:rPr>
+      </w:pPr>
       <w:r>
         <w:rPr>
           <w:rFonts w:ascii="Aptos" w:eastAsia="Aptos" w:hAnsi="Aptos" w:cs="Aptos"/>
         </w:rPr>
-        <w:t xml:space="preserve">Used the </w:t>
+        <w:t xml:space="preserve">The tests used the </w:t>
       </w:r>
       <w:proofErr w:type="spellStart"/>
       <w:r>
@@ -303,25 +286,51 @@
         <w:rPr>
           <w:rFonts w:ascii="Aptos" w:eastAsia="Aptos" w:hAnsi="Aptos" w:cs="Aptos"/>
         </w:rPr>
-        <w:t xml:space="preserve"> package in the ASP NET core Empty project </w:t>
+        <w:t xml:space="preserve"> package in an ASP.NET Core Empty project. The reverse proxy exposed the same application through the alpha, beta, and gamma path prefixes.</w:t>
       </w:r>
+    </w:p>
+    <w:p>
+      <w:pPr>
+        <w:rPr>
+          <w:rFonts w:ascii="Aptos" w:eastAsia="Aptos" w:hAnsi="Aptos" w:cs="Aptos"/>
+        </w:rPr>
+      </w:pPr>
       <w:r>
         <w:rPr>
           <w:rFonts w:ascii="Aptos" w:eastAsia="Aptos" w:hAnsi="Aptos" w:cs="Aptos"/>
         </w:rPr>
-        <w:t>with</w:t>
+        <w:t xml:space="preserve">For each route, YARP removed the matched prefix from the forwarded request path and set the X-Forwarded-Prefix request header to that prefix. The application used this header to establish the corresponding </w:t>
       </w:r>
+      <w:proofErr w:type="spellStart"/>
       <w:r>
         <w:rPr>
           <w:rFonts w:ascii="Aptos" w:eastAsia="Aptos" w:hAnsi="Aptos" w:cs="Aptos"/>
         </w:rPr>
-        <w:t xml:space="preserve"> the application with “alpha”, “beta” prefix.</w:t>
+        <w:t>PathBase</w:t>
       </w:r>
+      <w:proofErr w:type="spellEnd"/>
       <w:r>
         <w:rPr>
           <w:rFonts w:ascii="Aptos" w:eastAsia="Aptos" w:hAnsi="Aptos" w:cs="Aptos"/>
         </w:rPr>
-        <w:t xml:space="preserve"> </w:t>
+        <w:t>, allowing the same deployment to respond correctly through multiple path prefixes.</w:t>
+      </w:r>
+    </w:p>
+    <w:p>
+      <w:pPr>
+        <w:rPr>
+          <w:rFonts w:ascii="Aptos" w:eastAsia="Aptos" w:hAnsi="Aptos" w:cs="Aptos"/>
+          <w:b/>
+          <w:bCs/>
+        </w:rPr>
+      </w:pPr>
+      <w:r>
+        <w:rPr>
+          <w:rFonts w:ascii="Aptos" w:eastAsia="Aptos" w:hAnsi="Aptos" w:cs="Aptos"/>
+          <w:b/>
+          <w:bCs/>
+        </w:rPr>
+        <w:t>Published Application Test</w:t>
       </w:r>
     </w:p>
     <w:p>
@@ -334,20 +343,59 @@
         <w:rPr>
           <w:rFonts w:ascii="Aptos" w:eastAsia="Aptos" w:hAnsi="Aptos" w:cs="Aptos"/>
         </w:rPr>
-        <w:tab/>
-        <w:t xml:space="preserve">Sample: </w:t>
+        <w:t xml:space="preserve">The published YARP </w:t>
+      </w:r>
+      <w:proofErr w:type="spellStart"/>
+      <w:r>
+        <w:rPr>
+          <w:rFonts w:ascii="Aptos" w:eastAsia="Aptos" w:hAnsi="Aptos" w:cs="Aptos"/>
+        </w:rPr>
+        <w:t>PrefixProxy</w:t>
+      </w:r>
+      <w:proofErr w:type="spellEnd"/>
+      <w:r>
+        <w:rPr>
+          <w:rFonts w:ascii="Aptos" w:eastAsia="Aptos" w:hAnsi="Aptos" w:cs="Aptos"/>
+        </w:rPr>
+        <w:t xml:space="preserve"> ran at </w:t>
       </w:r>
       <w:hyperlink r:id="rId12" w:history="1">
-        <w:proofErr w:type="spellStart"/>
         <w:r>
           <w:rPr>
             <w:rStyle w:val="Hyperlink"/>
             <w:rFonts w:ascii="Aptos" w:eastAsia="Aptos" w:hAnsi="Aptos" w:cs="Aptos"/>
           </w:rPr>
-          <w:t>PrefixProxy</w:t>
+          <w:t>http://localhost:5080</w:t>
         </w:r>
-        <w:proofErr w:type="spellEnd"/>
       </w:hyperlink>
+      <w:r>
+        <w:rPr>
+          <w:rFonts w:ascii="Aptos" w:eastAsia="Aptos" w:hAnsi="Aptos" w:cs="Aptos"/>
+        </w:rPr>
+        <w:t> and forwarded requests from /alpha, /beta, and /gamma to the published application at </w:t>
+      </w:r>
+      <w:hyperlink r:id="rId13" w:history="1">
+        <w:r>
+          <w:rPr>
+            <w:rStyle w:val="Hyperlink"/>
+            <w:rFonts w:ascii="Aptos" w:eastAsia="Aptos" w:hAnsi="Aptos" w:cs="Aptos"/>
+          </w:rPr>
+          <w:t>http://localhost:5081</w:t>
+        </w:r>
+      </w:hyperlink>
+      <w:r>
+        <w:rPr>
+          <w:rFonts w:ascii="Aptos" w:eastAsia="Aptos" w:hAnsi="Aptos" w:cs="Aptos"/>
+        </w:rPr>
+        <w:t>.</w:t>
+      </w:r>
+    </w:p>
+    <w:p>
+      <w:pPr>
+        <w:rPr>
+          <w:rFonts w:ascii="Aptos" w:eastAsia="Aptos" w:hAnsi="Aptos" w:cs="Aptos"/>
+        </w:rPr>
+      </w:pPr>
     </w:p>
     <w:p>
       <w:pPr>
@@ -385,6 +433,7 @@
               </w:rPr>
             </w:pPr>
             <w:proofErr w:type="spellStart"/>
+            <w:proofErr w:type="gramStart"/>
             <w:r>
               <w:rPr>
                 <w:b/>
@@ -393,6 +442,7 @@
               <w:t>S.No</w:t>
             </w:r>
             <w:proofErr w:type="spellEnd"/>
+            <w:proofErr w:type="gramEnd"/>
           </w:p>
         </w:tc>
         <w:tc>
@@ -522,7 +572,15 @@
           </w:tcPr>
           <w:p>
             <w:r>
-              <w:t>Assets loads Alpha</w:t>
+              <w:t xml:space="preserve">Assets </w:t>
+            </w:r>
+            <w:proofErr w:type="gramStart"/>
+            <w:r>
+              <w:t>loads</w:t>
+            </w:r>
+            <w:proofErr w:type="gramEnd"/>
+            <w:r>
+              <w:t xml:space="preserve"> Alpha</w:t>
             </w:r>
           </w:p>
         </w:tc>
@@ -531,7 +589,7 @@
             <w:tcW w:w="1710" w:type="dxa"/>
           </w:tcPr>
           <w:p>
-            <w:hyperlink r:id="rId13" w:history="1">
+            <w:hyperlink r:id="rId14" w:history="1">
               <w:r>
                 <w:rPr>
                   <w:rStyle w:val="Hyperlink"/>
@@ -546,7 +604,7 @@
             <w:tcW w:w="2430" w:type="dxa"/>
           </w:tcPr>
           <w:p>
-            <w:hyperlink r:id="rId14" w:history="1">
+            <w:hyperlink r:id="rId15" w:history="1">
               <w:r>
                 <w:rPr>
                   <w:rStyle w:val="Hyperlink"/>
@@ -561,7 +619,7 @@
             <w:tcW w:w="2153" w:type="dxa"/>
           </w:tcPr>
           <w:p>
-            <w:hyperlink r:id="rId15" w:history="1">
+            <w:hyperlink r:id="rId16" w:history="1">
               <w:r>
                 <w:rPr>
                   <w:rStyle w:val="Hyperlink"/>
@@ -599,7 +657,15 @@
           </w:tcPr>
           <w:p>
             <w:r>
-              <w:t>Assets loads beta</w:t>
+              <w:t xml:space="preserve">Assets </w:t>
+            </w:r>
+            <w:proofErr w:type="gramStart"/>
+            <w:r>
+              <w:t>loads</w:t>
+            </w:r>
+            <w:proofErr w:type="gramEnd"/>
+            <w:r>
+              <w:t xml:space="preserve"> beta</w:t>
             </w:r>
           </w:p>
         </w:tc>
@@ -608,7 +674,7 @@
             <w:tcW w:w="1710" w:type="dxa"/>
           </w:tcPr>
           <w:p>
-            <w:hyperlink r:id="rId16" w:history="1">
+            <w:hyperlink r:id="rId17" w:history="1">
               <w:r>
                 <w:rPr>
                   <w:rStyle w:val="Hyperlink"/>
@@ -623,7 +689,7 @@
             <w:tcW w:w="2430" w:type="dxa"/>
           </w:tcPr>
           <w:p>
-            <w:hyperlink r:id="rId17" w:history="1">
+            <w:hyperlink r:id="rId18" w:history="1">
               <w:r>
                 <w:rPr>
                   <w:rStyle w:val="Hyperlink"/>
@@ -638,7 +704,7 @@
             <w:tcW w:w="2153" w:type="dxa"/>
           </w:tcPr>
           <w:p>
-            <w:hyperlink r:id="rId18" w:history="1">
+            <w:hyperlink r:id="rId19" w:history="1">
               <w:r>
                 <w:rPr>
                   <w:rStyle w:val="Hyperlink"/>
@@ -677,7 +743,10 @@
           </w:tcPr>
           <w:p>
             <w:r>
-              <w:t>interactivity starts</w:t>
+              <w:t>I</w:t>
+            </w:r>
+            <w:r>
+              <w:t>nteractivity starts</w:t>
             </w:r>
             <w:r>
               <w:t xml:space="preserve"> alpha</w:t>
@@ -700,7 +769,7 @@
             <w:tcW w:w="2430" w:type="dxa"/>
           </w:tcPr>
           <w:p>
-            <w:hyperlink r:id="rId19" w:history="1">
+            <w:hyperlink r:id="rId20" w:history="1">
               <w:r>
                 <w:rPr>
                   <w:rStyle w:val="Hyperlink"/>
@@ -715,7 +784,7 @@
             <w:tcW w:w="2153" w:type="dxa"/>
           </w:tcPr>
           <w:p>
-            <w:hyperlink r:id="rId20" w:history="1">
+            <w:hyperlink r:id="rId21" w:history="1">
               <w:r>
                 <w:rPr>
                   <w:rStyle w:val="Hyperlink"/>
@@ -743,7 +812,6 @@
           </w:tcPr>
           <w:p>
             <w:r>
-              <w:lastRenderedPageBreak/>
               <w:t>4</w:t>
             </w:r>
           </w:p>
@@ -754,7 +822,10 @@
           </w:tcPr>
           <w:p>
             <w:r>
-              <w:t>interactivity starts</w:t>
+              <w:t>I</w:t>
+            </w:r>
+            <w:r>
+              <w:t>nteractivity starts</w:t>
             </w:r>
             <w:r>
               <w:t xml:space="preserve"> Beta</w:t>
@@ -784,7 +855,7 @@
             <w:tcW w:w="2430" w:type="dxa"/>
           </w:tcPr>
           <w:p>
-            <w:hyperlink r:id="rId21" w:history="1">
+            <w:hyperlink r:id="rId22" w:history="1">
               <w:r>
                 <w:rPr>
                   <w:rStyle w:val="Hyperlink"/>
@@ -800,7 +871,7 @@
             <w:tcW w:w="2153" w:type="dxa"/>
           </w:tcPr>
           <w:p>
-            <w:hyperlink r:id="rId22" w:history="1">
+            <w:hyperlink r:id="rId23" w:history="1">
               <w:r>
                 <w:rPr>
                   <w:rStyle w:val="Hyperlink"/>
@@ -838,10 +909,23 @@
           </w:tcPr>
           <w:p>
             <w:r>
-              <w:t> navigation stays inside that prefix</w:t>
-            </w:r>
-            <w:r>
-              <w:t xml:space="preserve"> alpha</w:t>
+              <w:t> </w:t>
+            </w:r>
+            <w:r>
+              <w:t>N</w:t>
+            </w:r>
+            <w:r>
+              <w:t>avigation stays inside that prefix</w:t>
+            </w:r>
+            <w:r>
+              <w:t xml:space="preserve"> </w:t>
+            </w:r>
+            <w:r>
+              <w:rPr>
+                <w:b/>
+                <w:bCs/>
+              </w:rPr>
+              <w:t>alpha</w:t>
             </w:r>
           </w:p>
         </w:tc>
@@ -849,25 +933,95 @@
           <w:tcPr>
             <w:tcW w:w="1710" w:type="dxa"/>
           </w:tcPr>
-          <w:p/>
+          <w:p>
+            <w:r>
+              <w:t xml:space="preserve"> </w:t>
+            </w:r>
+            <w:hyperlink r:id="rId24" w:history="1">
+              <w:r>
+                <w:rPr>
+                  <w:rStyle w:val="Hyperlink"/>
+                </w:rPr>
+                <w:t>Before navigation alpha.png</w:t>
+              </w:r>
+            </w:hyperlink>
+            <w:r>
+              <w:t xml:space="preserve"> </w:t>
+            </w:r>
+            <w:r>
+              <w:t xml:space="preserve">and </w:t>
+            </w:r>
+            <w:hyperlink r:id="rId25" w:history="1">
+              <w:r>
+                <w:rPr>
+                  <w:rStyle w:val="Hyperlink"/>
+                </w:rPr>
+                <w:t>After navigation alpha.png</w:t>
+              </w:r>
+            </w:hyperlink>
+          </w:p>
         </w:tc>
         <w:tc>
           <w:tcPr>
             <w:tcW w:w="2430" w:type="dxa"/>
           </w:tcPr>
-          <w:p/>
+          <w:p>
+            <w:hyperlink r:id="rId26" w:history="1">
+              <w:r>
+                <w:rPr>
+                  <w:rStyle w:val="Hyperlink"/>
+                </w:rPr>
+                <w:t>Before navigation alpha.png</w:t>
+              </w:r>
+            </w:hyperlink>
+            <w:r>
+              <w:t xml:space="preserve"> &amp; </w:t>
+            </w:r>
+            <w:hyperlink r:id="rId27" w:history="1">
+              <w:r>
+                <w:rPr>
+                  <w:rStyle w:val="Hyperlink"/>
+                </w:rPr>
+                <w:t>After navigation alpha.png</w:t>
+              </w:r>
+            </w:hyperlink>
+          </w:p>
         </w:tc>
         <w:tc>
           <w:tcPr>
             <w:tcW w:w="2153" w:type="dxa"/>
           </w:tcPr>
-          <w:p/>
+          <w:p>
+            <w:hyperlink r:id="rId28" w:history="1">
+              <w:r>
+                <w:rPr>
+                  <w:rStyle w:val="Hyperlink"/>
+                </w:rPr>
+                <w:t>Before navigation alpha.png</w:t>
+              </w:r>
+            </w:hyperlink>
+            <w:r>
+              <w:t xml:space="preserve"> and </w:t>
+            </w:r>
+            <w:hyperlink r:id="rId29" w:history="1">
+              <w:r>
+                <w:rPr>
+                  <w:rStyle w:val="Hyperlink"/>
+                </w:rPr>
+                <w:t>After navigation alpha.png</w:t>
+              </w:r>
+            </w:hyperlink>
+          </w:p>
         </w:tc>
         <w:tc>
           <w:tcPr>
             <w:tcW w:w="1357" w:type="dxa"/>
           </w:tcPr>
-          <w:p/>
+          <w:p>
+            <w:r>
+              <w:t>pass</w:t>
+            </w:r>
+          </w:p>
         </w:tc>
       </w:tr>
       <w:tr>
@@ -885,31 +1039,114 @@
           <w:tcPr>
             <w:tcW w:w="1890" w:type="dxa"/>
           </w:tcPr>
-          <w:p/>
+          <w:p>
+            <w:r>
+              <w:t>N</w:t>
+            </w:r>
+            <w:r>
+              <w:t>avigation stays inside that prefix</w:t>
+            </w:r>
+            <w:r>
+              <w:t xml:space="preserve"> </w:t>
+            </w:r>
+            <w:r>
+              <w:rPr>
+                <w:b/>
+                <w:bCs/>
+              </w:rPr>
+              <w:t>beta</w:t>
+            </w:r>
+          </w:p>
         </w:tc>
         <w:tc>
           <w:tcPr>
             <w:tcW w:w="1710" w:type="dxa"/>
           </w:tcPr>
-          <w:p/>
+          <w:p>
+            <w:hyperlink r:id="rId30" w:history="1">
+              <w:r>
+                <w:rPr>
+                  <w:rStyle w:val="Hyperlink"/>
+                </w:rPr>
+                <w:t>Before navigation beta.png</w:t>
+              </w:r>
+            </w:hyperlink>
+            <w:r>
+              <w:t xml:space="preserve"> &amp; </w:t>
+            </w:r>
+            <w:hyperlink r:id="rId31" w:history="1">
+              <w:r>
+                <w:rPr>
+                  <w:rStyle w:val="Hyperlink"/>
+                </w:rPr>
+                <w:t>After navigation beta.png</w:t>
+              </w:r>
+            </w:hyperlink>
+          </w:p>
         </w:tc>
         <w:tc>
           <w:tcPr>
             <w:tcW w:w="2430" w:type="dxa"/>
           </w:tcPr>
-          <w:p/>
+          <w:p>
+            <w:hyperlink r:id="rId32" w:history="1">
+              <w:r>
+                <w:rPr>
+                  <w:rStyle w:val="Hyperlink"/>
+                </w:rPr>
+                <w:t>Before navigation beta.png</w:t>
+              </w:r>
+            </w:hyperlink>
+            <w:r>
+              <w:t xml:space="preserve"> &amp; </w:t>
+            </w:r>
+          </w:p>
+          <w:p>
+            <w:hyperlink r:id="rId33" w:history="1">
+              <w:r>
+                <w:rPr>
+                  <w:rStyle w:val="Hyperlink"/>
+                </w:rPr>
+                <w:t>After navigation beta.png</w:t>
+              </w:r>
+            </w:hyperlink>
+          </w:p>
         </w:tc>
         <w:tc>
           <w:tcPr>
             <w:tcW w:w="2153" w:type="dxa"/>
           </w:tcPr>
-          <w:p/>
+          <w:p>
+            <w:hyperlink r:id="rId34" w:history="1">
+              <w:r>
+                <w:rPr>
+                  <w:rStyle w:val="Hyperlink"/>
+                </w:rPr>
+                <w:t>Before navigation beta.png</w:t>
+              </w:r>
+            </w:hyperlink>
+            <w:r>
+              <w:t xml:space="preserve"> and </w:t>
+            </w:r>
+            <w:hyperlink r:id="rId35" w:history="1">
+              <w:r>
+                <w:rPr>
+                  <w:rStyle w:val="Hyperlink"/>
+                </w:rPr>
+                <w:t>After navigation beta.png</w:t>
+              </w:r>
+            </w:hyperlink>
+          </w:p>
         </w:tc>
         <w:tc>
           <w:tcPr>
             <w:tcW w:w="1357" w:type="dxa"/>
           </w:tcPr>
-          <w:p/>
+          <w:p>
+            <w:r>
+              <w:t>pass</w:t>
+            </w:r>
+          </w:p>
         </w:tc>
       </w:tr>
       <w:tr>
@@ -919,7 +1156,7 @@
           </w:tcPr>
           <w:p>
             <w:r>
-              <w:t>5</w:t>
+              <w:t>7</w:t>
             </w:r>
           </w:p>
         </w:tc>
@@ -939,7 +1176,7 @@
             <w:tcW w:w="1710" w:type="dxa"/>
           </w:tcPr>
           <w:p>
-            <w:hyperlink r:id="rId23" w:history="1">
+            <w:hyperlink r:id="rId36" w:history="1">
               <w:r>
                 <w:rPr>
                   <w:rStyle w:val="Hyperlink"/>
@@ -954,7 +1191,7 @@
             <w:tcW w:w="2430" w:type="dxa"/>
           </w:tcPr>
           <w:p>
-            <w:hyperlink r:id="rId24" w:history="1">
+            <w:hyperlink r:id="rId37" w:history="1">
               <w:r>
                 <w:rPr>
                   <w:rStyle w:val="Hyperlink"/>
@@ -969,7 +1206,7 @@
             <w:tcW w:w="2153" w:type="dxa"/>
           </w:tcPr>
           <w:p>
-            <w:hyperlink r:id="rId25" w:history="1">
+            <w:hyperlink r:id="rId38" w:history="1">
               <w:r>
                 <w:rPr>
                   <w:rStyle w:val="Hyperlink"/>
@@ -997,7 +1234,7 @@
           </w:tcPr>
           <w:p>
             <w:r>
-              <w:t>6</w:t>
+              <w:t>8</w:t>
             </w:r>
           </w:p>
         </w:tc>
@@ -1007,7 +1244,11 @@
           </w:tcPr>
           <w:p>
             <w:r>
-              <w:t>With both prefixes open at the same time, neither one produces links belonging to the other.</w:t>
+              <w:t xml:space="preserve">With both prefixes open at the same time, neither one produces links </w:t>
+            </w:r>
+            <w:r>
+              <w:lastRenderedPageBreak/>
+              <w:t>belonging to the other.</w:t>
             </w:r>
           </w:p>
           <w:p/>
@@ -1017,7 +1258,7 @@
             <w:tcW w:w="1710" w:type="dxa"/>
           </w:tcPr>
           <w:p>
-            <w:hyperlink r:id="rId26" w:history="1">
+            <w:hyperlink r:id="rId39" w:history="1">
               <w:r>
                 <w:rPr>
                   <w:rStyle w:val="Hyperlink"/>
@@ -1032,7 +1273,7 @@
             <w:tcW w:w="2430" w:type="dxa"/>
           </w:tcPr>
           <w:p>
-            <w:hyperlink r:id="rId27" w:history="1">
+            <w:hyperlink r:id="rId40" w:history="1">
               <w:r>
                 <w:rPr>
                   <w:rStyle w:val="Hyperlink"/>
@@ -1047,7 +1288,7 @@
             <w:tcW w:w="2153" w:type="dxa"/>
           </w:tcPr>
           <w:p>
-            <w:hyperlink r:id="rId28" w:history="1">
+            <w:hyperlink r:id="rId41" w:history="1">
               <w:r>
                 <w:rPr>
                   <w:rStyle w:val="Hyperlink"/>
@@ -1075,7 +1316,7 @@
           </w:tcPr>
           <w:p>
             <w:r>
-              <w:t>7</w:t>
+              <w:t>9</w:t>
             </w:r>
           </w:p>
         </w:tc>
@@ -1111,12 +1352,24 @@
             <w:tcW w:w="1710" w:type="dxa"/>
           </w:tcPr>
           <w:p>
-            <w:hyperlink r:id="rId29" w:history="1">
-              <w:r>
-                <w:rPr>
-                  <w:rStyle w:val="Hyperlink"/>
-                </w:rPr>
-                <w:t>Alpha-Form-Submit-Test.png</w:t>
+            <w:hyperlink r:id="rId42" w:history="1">
+              <w:r>
+                <w:rPr>
+                  <w:rStyle w:val="Hyperlink"/>
+                </w:rPr>
+                <w:t>Alpha-Form-Submi</w:t>
+              </w:r>
+              <w:r>
+                <w:rPr>
+                  <w:rStyle w:val="Hyperlink"/>
+                </w:rPr>
+                <w:t>t</w:t>
+              </w:r>
+              <w:r>
+                <w:rPr>
+                  <w:rStyle w:val="Hyperlink"/>
+                </w:rPr>
+                <w:t>-Test.png</w:t>
               </w:r>
             </w:hyperlink>
           </w:p>
@@ -1126,12 +1379,18 @@
             <w:tcW w:w="2430" w:type="dxa"/>
           </w:tcPr>
           <w:p>
-            <w:hyperlink r:id="rId30" w:history="1">
-              <w:r>
-                <w:rPr>
-                  <w:rStyle w:val="Hyperlink"/>
-                </w:rPr>
-                <w:t>Alpha-Form-Submit-Test.png</w:t>
+            <w:hyperlink r:id="rId43" w:history="1">
+              <w:r>
+                <w:rPr>
+                  <w:rStyle w:val="Hyperlink"/>
+                </w:rPr>
+                <w:t>Alpha-Form-Submit-Test.pn</w:t>
+              </w:r>
+              <w:r>
+                <w:rPr>
+                  <w:rStyle w:val="Hyperlink"/>
+                </w:rPr>
+                <w:t>g</w:t>
               </w:r>
             </w:hyperlink>
           </w:p>
@@ -1141,12 +1400,24 @@
             <w:tcW w:w="2153" w:type="dxa"/>
           </w:tcPr>
           <w:p>
-            <w:hyperlink r:id="rId31" w:history="1">
-              <w:r>
-                <w:rPr>
-                  <w:rStyle w:val="Hyperlink"/>
-                </w:rPr>
-                <w:t>Alpha-Form-Submit-Test.png</w:t>
+            <w:hyperlink r:id="rId44" w:history="1">
+              <w:r>
+                <w:rPr>
+                  <w:rStyle w:val="Hyperlink"/>
+                </w:rPr>
+                <w:t>Alpha-Form-Submit-T</w:t>
+              </w:r>
+              <w:r>
+                <w:rPr>
+                  <w:rStyle w:val="Hyperlink"/>
+                </w:rPr>
+                <w:t>e</w:t>
+              </w:r>
+              <w:r>
+                <w:rPr>
+                  <w:rStyle w:val="Hyperlink"/>
+                </w:rPr>
+                <w:t>st.png</w:t>
               </w:r>
             </w:hyperlink>
           </w:p>
@@ -1169,7 +1440,7 @@
           </w:tcPr>
           <w:p>
             <w:r>
-              <w:t>8</w:t>
+              <w:t>10</w:t>
             </w:r>
           </w:p>
         </w:tc>
@@ -1198,7 +1469,7 @@
             <w:tcW w:w="1710" w:type="dxa"/>
           </w:tcPr>
           <w:p>
-            <w:hyperlink r:id="rId32" w:history="1">
+            <w:hyperlink r:id="rId45" w:history="1">
               <w:r>
                 <w:rPr>
                   <w:rStyle w:val="Hyperlink"/>
@@ -1213,12 +1484,24 @@
             <w:tcW w:w="2430" w:type="dxa"/>
           </w:tcPr>
           <w:p>
-            <w:hyperlink r:id="rId33" w:history="1">
-              <w:r>
-                <w:rPr>
-                  <w:rStyle w:val="Hyperlink"/>
-                </w:rPr>
-                <w:t>Beta-Form_Submit-Test.png</w:t>
+            <w:hyperlink r:id="rId46" w:history="1">
+              <w:r>
+                <w:rPr>
+                  <w:rStyle w:val="Hyperlink"/>
+                </w:rPr>
+                <w:t>Beta</w:t>
+              </w:r>
+              <w:r>
+                <w:rPr>
+                  <w:rStyle w:val="Hyperlink"/>
+                </w:rPr>
+                <w:t>-</w:t>
+              </w:r>
+              <w:r>
+                <w:rPr>
+                  <w:rStyle w:val="Hyperlink"/>
+                </w:rPr>
+                <w:t>Form_Submit-Test.png</w:t>
               </w:r>
             </w:hyperlink>
           </w:p>
@@ -1228,12 +1511,24 @@
             <w:tcW w:w="2153" w:type="dxa"/>
           </w:tcPr>
           <w:p>
-            <w:hyperlink r:id="rId34" w:history="1">
-              <w:r>
-                <w:rPr>
-                  <w:rStyle w:val="Hyperlink"/>
-                </w:rPr>
-                <w:t>Beta-Form_Submit-Test.png</w:t>
+            <w:hyperlink r:id="rId47" w:history="1">
+              <w:r>
+                <w:rPr>
+                  <w:rStyle w:val="Hyperlink"/>
+                </w:rPr>
+                <w:t>Beta-Fo</w:t>
+              </w:r>
+              <w:r>
+                <w:rPr>
+                  <w:rStyle w:val="Hyperlink"/>
+                </w:rPr>
+                <w:t>r</w:t>
+              </w:r>
+              <w:r>
+                <w:rPr>
+                  <w:rStyle w:val="Hyperlink"/>
+                </w:rPr>
+                <w:t>m_Submit-Test.png</w:t>
               </w:r>
             </w:hyperlink>
           </w:p>
@@ -1256,7 +1551,7 @@
           </w:tcPr>
           <w:p>
             <w:r>
-              <w:t>9</w:t>
+              <w:t>11</w:t>
             </w:r>
           </w:p>
         </w:tc>
@@ -1266,7 +1561,15 @@
           </w:tcPr>
           <w:p>
             <w:r>
-              <w:t>Adding a prefix requires no source change and no rebuild.</w:t>
+              <w:t xml:space="preserve">Adding a prefix requires no source change and no </w:t>
+            </w:r>
+            <w:proofErr w:type="gramStart"/>
+            <w:r>
+              <w:t>rebuild</w:t>
+            </w:r>
+            <w:proofErr w:type="gramEnd"/>
+            <w:r>
+              <w:t>.</w:t>
             </w:r>
           </w:p>
           <w:p/>
@@ -1276,7 +1579,7 @@
             <w:tcW w:w="1710" w:type="dxa"/>
           </w:tcPr>
           <w:p>
-            <w:hyperlink r:id="rId35" w:history="1">
+            <w:hyperlink r:id="rId48" w:history="1">
               <w:r>
                 <w:rPr>
                   <w:rStyle w:val="Hyperlink"/>
@@ -1291,7 +1594,7 @@
             <w:tcW w:w="2430" w:type="dxa"/>
           </w:tcPr>
           <w:p>
-            <w:hyperlink r:id="rId36" w:history="1">
+            <w:hyperlink r:id="rId49" w:history="1">
               <w:r>
                 <w:rPr>
                   <w:rStyle w:val="Hyperlink"/>
@@ -1306,7 +1609,7 @@
             <w:tcW w:w="2153" w:type="dxa"/>
           </w:tcPr>
           <w:p>
-            <w:hyperlink r:id="rId37" w:history="1">
+            <w:hyperlink r:id="rId50" w:history="1">
               <w:r>
                 <w:rPr>
                   <w:rStyle w:val="Hyperlink"/>
@@ -1334,8 +1637,10 @@
           </w:tcPr>
           <w:p>
             <w:r>
-              <w:lastRenderedPageBreak/>
-              <w:t>10</w:t>
+              <w:t>1</w:t>
+            </w:r>
+            <w:r>
+              <w:t>2</w:t>
             </w:r>
           </w:p>
         </w:tc>
@@ -1387,7 +1692,7 @@
             <w:tcW w:w="1710" w:type="dxa"/>
           </w:tcPr>
           <w:p>
-            <w:hyperlink r:id="rId38" w:history="1">
+            <w:hyperlink r:id="rId51" w:history="1">
               <w:r>
                 <w:rPr>
                   <w:rStyle w:val="Hyperlink"/>
@@ -1405,7 +1710,7 @@
             <w:tcW w:w="2430" w:type="dxa"/>
           </w:tcPr>
           <w:p>
-            <w:hyperlink r:id="rId39" w:history="1">
+            <w:hyperlink r:id="rId52" w:history="1">
               <w:r>
                 <w:rPr>
                   <w:rStyle w:val="Hyperlink"/>
@@ -1420,7 +1725,7 @@
             <w:tcW w:w="2153" w:type="dxa"/>
           </w:tcPr>
           <w:p>
-            <w:hyperlink r:id="rId40" w:history="1">
+            <w:hyperlink r:id="rId53" w:history="1">
               <w:r>
                 <w:rPr>
                   <w:rStyle w:val="Hyperlink"/>
@@ -1448,7 +1753,10 @@
           </w:tcPr>
           <w:p>
             <w:r>
-              <w:t>11</w:t>
+              <w:t>1</w:t>
+            </w:r>
+            <w:r>
+              <w:t>3</w:t>
             </w:r>
           </w:p>
         </w:tc>
@@ -1477,7 +1785,7 @@
             <w:tcW w:w="1710" w:type="dxa"/>
           </w:tcPr>
           <w:p>
-            <w:hyperlink r:id="rId41" w:history="1">
+            <w:hyperlink r:id="rId54" w:history="1">
               <w:r>
                 <w:rPr>
                   <w:rStyle w:val="Hyperlink"/>
@@ -1492,7 +1800,7 @@
             <w:tcW w:w="2430" w:type="dxa"/>
           </w:tcPr>
           <w:p>
-            <w:hyperlink r:id="rId42" w:history="1">
+            <w:hyperlink r:id="rId55" w:history="1">
               <w:r>
                 <w:rPr>
                   <w:rStyle w:val="Hyperlink"/>
@@ -1507,7 +1815,7 @@
             <w:tcW w:w="2153" w:type="dxa"/>
           </w:tcPr>
           <w:p>
-            <w:hyperlink r:id="rId43" w:history="1">
+            <w:hyperlink r:id="rId56" w:history="1">
               <w:r>
                 <w:rPr>
                   <w:rStyle w:val="Hyperlink"/>
@@ -1535,7 +1843,10 @@
           </w:tcPr>
           <w:p>
             <w:r>
-              <w:t>12</w:t>
+              <w:t>1</w:t>
+            </w:r>
+            <w:r>
+              <w:t>4</w:t>
             </w:r>
           </w:p>
         </w:tc>
@@ -1555,12 +1866,24 @@
             <w:tcW w:w="1710" w:type="dxa"/>
           </w:tcPr>
           <w:p>
-            <w:hyperlink r:id="rId44" w:history="1">
-              <w:r>
-                <w:rPr>
-                  <w:rStyle w:val="Hyperlink"/>
-                </w:rPr>
-                <w:t>Both prefixes on different browser.png</w:t>
+            <w:hyperlink r:id="rId57" w:history="1">
+              <w:r>
+                <w:rPr>
+                  <w:rStyle w:val="Hyperlink"/>
+                </w:rPr>
+                <w:t>Both prefixes on</w:t>
+              </w:r>
+              <w:r>
+                <w:rPr>
+                  <w:rStyle w:val="Hyperlink"/>
+                </w:rPr>
+                <w:t xml:space="preserve"> </w:t>
+              </w:r>
+              <w:r>
+                <w:rPr>
+                  <w:rStyle w:val="Hyperlink"/>
+                </w:rPr>
+                <w:t>different browser.png</w:t>
               </w:r>
             </w:hyperlink>
           </w:p>
@@ -1570,12 +1893,24 @@
             <w:tcW w:w="2430" w:type="dxa"/>
           </w:tcPr>
           <w:p>
-            <w:hyperlink r:id="rId45" w:history="1">
-              <w:r>
-                <w:rPr>
-                  <w:rStyle w:val="Hyperlink"/>
-                </w:rPr>
-                <w:t>Both prefixes on different browser.png</w:t>
+            <w:hyperlink r:id="rId58" w:history="1">
+              <w:r>
+                <w:rPr>
+                  <w:rStyle w:val="Hyperlink"/>
+                </w:rPr>
+                <w:t>Both prefixes on different brow</w:t>
+              </w:r>
+              <w:r>
+                <w:rPr>
+                  <w:rStyle w:val="Hyperlink"/>
+                </w:rPr>
+                <w:t>s</w:t>
+              </w:r>
+              <w:r>
+                <w:rPr>
+                  <w:rStyle w:val="Hyperlink"/>
+                </w:rPr>
+                <w:t>er.png</w:t>
               </w:r>
             </w:hyperlink>
           </w:p>
@@ -1585,12 +1920,24 @@
             <w:tcW w:w="2153" w:type="dxa"/>
           </w:tcPr>
           <w:p>
-            <w:hyperlink r:id="rId46" w:history="1">
-              <w:r>
-                <w:rPr>
-                  <w:rStyle w:val="Hyperlink"/>
-                </w:rPr>
-                <w:t>Both prefixes on different browser.png</w:t>
+            <w:hyperlink r:id="rId59" w:history="1">
+              <w:r>
+                <w:rPr>
+                  <w:rStyle w:val="Hyperlink"/>
+                </w:rPr>
+                <w:t>Both prefixes on diffe</w:t>
+              </w:r>
+              <w:r>
+                <w:rPr>
+                  <w:rStyle w:val="Hyperlink"/>
+                </w:rPr>
+                <w:t>r</w:t>
+              </w:r>
+              <w:r>
+                <w:rPr>
+                  <w:rStyle w:val="Hyperlink"/>
+                </w:rPr>
+                <w:t>ent browser.png</w:t>
               </w:r>
             </w:hyperlink>
           </w:p>
@@ -1613,7 +1960,10 @@
           </w:tcPr>
           <w:p>
             <w:r>
-              <w:t>13</w:t>
+              <w:t>1</w:t>
+            </w:r>
+            <w:r>
+              <w:t>5</w:t>
             </w:r>
           </w:p>
         </w:tc>
@@ -1640,7 +1990,7 @@
             <w:tcW w:w="1710" w:type="dxa"/>
           </w:tcPr>
           <w:p>
-            <w:hyperlink r:id="rId47" w:history="1">
+            <w:hyperlink r:id="rId60" w:history="1">
               <w:r>
                 <w:rPr>
                   <w:rStyle w:val="Hyperlink"/>
@@ -1659,7 +2009,14 @@
                 <w:rPr>
                   <w:rStyle w:val="Hyperlink"/>
                 </w:rPr>
-                <w:t xml:space="preserve"> configuration.zip</w:t>
+                <w:t xml:space="preserve"> </w:t>
+              </w:r>
+              <w:r>
+                <w:rPr>
+                  <w:rStyle w:val="Hyperlink"/>
+                </w:rPr>
+                <w:lastRenderedPageBreak/>
+                <w:t>configuration.zip</w:t>
               </w:r>
             </w:hyperlink>
           </w:p>
@@ -1669,7 +2026,7 @@
             <w:tcW w:w="2430" w:type="dxa"/>
           </w:tcPr>
           <w:p>
-            <w:hyperlink r:id="rId48" w:history="1">
+            <w:hyperlink r:id="rId61" w:history="1">
               <w:r>
                 <w:rPr>
                   <w:rStyle w:val="Hyperlink"/>
@@ -1684,7 +2041,7 @@
             <w:tcW w:w="2153" w:type="dxa"/>
           </w:tcPr>
           <w:p>
-            <w:hyperlink r:id="rId49" w:history="1">
+            <w:hyperlink r:id="rId62" w:history="1">
               <w:r>
                 <w:rPr>
                   <w:rStyle w:val="Hyperlink"/>
@@ -1726,7 +2083,10 @@
           </w:tcPr>
           <w:p>
             <w:r>
-              <w:t>14</w:t>
+              <w:t>1</w:t>
+            </w:r>
+            <w:r>
+              <w:t>6</w:t>
             </w:r>
           </w:p>
         </w:tc>
@@ -1745,7 +2105,7 @@
             <w:tcW w:w="1710" w:type="dxa"/>
           </w:tcPr>
           <w:p>
-            <w:hyperlink r:id="rId50" w:history="1">
+            <w:hyperlink r:id="rId63" w:history="1">
               <w:r>
                 <w:rPr>
                   <w:rStyle w:val="Hyperlink"/>
@@ -1760,7 +2120,7 @@
             <w:tcW w:w="2430" w:type="dxa"/>
           </w:tcPr>
           <w:p>
-            <w:hyperlink r:id="rId51" w:history="1">
+            <w:hyperlink r:id="rId64" w:history="1">
               <w:r>
                 <w:rPr>
                   <w:rStyle w:val="Hyperlink"/>
@@ -1775,7 +2135,7 @@
             <w:tcW w:w="2153" w:type="dxa"/>
           </w:tcPr>
           <w:p>
-            <w:hyperlink r:id="rId52" w:history="1">
+            <w:hyperlink r:id="rId65" w:history="1">
               <w:r>
                 <w:rPr>
                   <w:rStyle w:val="Hyperlink"/>
@@ -1803,7 +2163,10 @@
           </w:tcPr>
           <w:p>
             <w:r>
-              <w:t>15</w:t>
+              <w:t>1</w:t>
+            </w:r>
+            <w:r>
+              <w:t>7</w:t>
             </w:r>
           </w:p>
         </w:tc>
@@ -1822,7 +2185,7 @@
             <w:tcW w:w="1710" w:type="dxa"/>
           </w:tcPr>
           <w:p>
-            <w:hyperlink r:id="rId53" w:history="1">
+            <w:hyperlink r:id="rId66" w:history="1">
               <w:r>
                 <w:rPr>
                   <w:rStyle w:val="Hyperlink"/>
@@ -1837,7 +2200,7 @@
             <w:tcW w:w="2430" w:type="dxa"/>
           </w:tcPr>
           <w:p>
-            <w:hyperlink r:id="rId54" w:history="1">
+            <w:hyperlink r:id="rId67" w:history="1">
               <w:proofErr w:type="spellStart"/>
               <w:r>
                 <w:rPr>
@@ -1860,7 +2223,7 @@
             <w:tcW w:w="2153" w:type="dxa"/>
           </w:tcPr>
           <w:p>
-            <w:hyperlink r:id="rId55" w:history="1">
+            <w:hyperlink r:id="rId68" w:history="1">
               <w:r>
                 <w:rPr>
                   <w:rStyle w:val="Hyperlink"/>
@@ -1888,7 +2251,10 @@
           </w:tcPr>
           <w:p>
             <w:r>
-              <w:t>16</w:t>
+              <w:t>1</w:t>
+            </w:r>
+            <w:r>
+              <w:t>8</w:t>
             </w:r>
           </w:p>
         </w:tc>
@@ -1907,7 +2273,7 @@
             <w:tcW w:w="1710" w:type="dxa"/>
           </w:tcPr>
           <w:p>
-            <w:hyperlink r:id="rId56" w:history="1">
+            <w:hyperlink r:id="rId69" w:history="1">
               <w:r>
                 <w:rPr>
                   <w:rStyle w:val="Hyperlink"/>
@@ -1922,7 +2288,7 @@
             <w:tcW w:w="2430" w:type="dxa"/>
           </w:tcPr>
           <w:p>
-            <w:hyperlink r:id="rId57" w:history="1">
+            <w:hyperlink r:id="rId70" w:history="1">
               <w:r>
                 <w:rPr>
                   <w:rStyle w:val="Hyperlink"/>
@@ -1937,7 +2303,7 @@
             <w:tcW w:w="2153" w:type="dxa"/>
           </w:tcPr>
           <w:p>
-            <w:hyperlink r:id="rId58" w:history="1">
+            <w:hyperlink r:id="rId71" w:history="1">
               <w:r>
                 <w:rPr>
                   <w:rStyle w:val="Hyperlink"/>
@@ -4116,6 +4482,123 @@
     </w:lvl>
   </w:abstractNum>
   <w:abstractNum w:abstractNumId="15" w15:restartNumberingAfterBreak="0">
+    <w:nsid w:val="686375B7"/>
+    <w:multiLevelType w:val="multilevel"/>
+    <w:tmpl w:val="9A206D2C"/>
+    <w:lvl w:ilvl="0">
+      <w:start w:val="1"/>
+      <w:numFmt w:val="decimal"/>
+      <w:lvlText w:val="%1."/>
+      <w:lvlJc w:val="left"/>
+      <w:pPr>
+        <w:tabs>
+          <w:tab w:val="num" w:pos="720"/>
+        </w:tabs>
+        <w:ind w:left="720" w:hanging="360"/>
+      </w:pPr>
+    </w:lvl>
+    <w:lvl w:ilvl="1">
+      <w:start w:val="1"/>
+      <w:numFmt w:val="bullet"/>
+      <w:lvlText w:val="o"/>
+      <w:lvlJc w:val="left"/>
+      <w:pPr>
+        <w:tabs>
+          <w:tab w:val="num" w:pos="1440"/>
+        </w:tabs>
+        <w:ind w:left="1440" w:hanging="360"/>
+      </w:pPr>
+      <w:rPr>
+        <w:rFonts w:ascii="Courier New" w:hAnsi="Courier New" w:hint="default"/>
+        <w:sz w:val="20"/>
+      </w:rPr>
+    </w:lvl>
+    <w:lvl w:ilvl="2" w:tentative="1">
+      <w:start w:val="1"/>
+      <w:numFmt w:val="decimal"/>
+      <w:lvlText w:val="%3."/>
+      <w:lvlJc w:val="left"/>
+      <w:pPr>
+        <w:tabs>
+          <w:tab w:val="num" w:pos="2160"/>
+        </w:tabs>
+        <w:ind w:left="2160" w:hanging="360"/>
+      </w:pPr>
+    </w:lvl>
+    <w:lvl w:ilvl="3" w:tentative="1">
+      <w:start w:val="1"/>
+      <w:numFmt w:val="decimal"/>
+      <w:lvlText w:val="%4."/>
+      <w:lvlJc w:val="left"/>
+      <w:pPr>
+        <w:tabs>
+          <w:tab w:val="num" w:pos="2880"/>
+        </w:tabs>
+        <w:ind w:left="2880" w:hanging="360"/>
+      </w:pPr>
+    </w:lvl>
+    <w:lvl w:ilvl="4" w:tentative="1">
+      <w:start w:val="1"/>
+      <w:numFmt w:val="decimal"/>
+      <w:lvlText w:val="%5."/>
+      <w:lvlJc w:val="left"/>
+      <w:pPr>
+        <w:tabs>
+          <w:tab w:val="num" w:pos="3600"/>
+        </w:tabs>
+        <w:ind w:left="3600" w:hanging="360"/>
+      </w:pPr>
+    </w:lvl>
+    <w:lvl w:ilvl="5" w:tentative="1">
+      <w:start w:val="1"/>
+      <w:numFmt w:val="decimal"/>
+      <w:lvlText w:val="%6."/>
+      <w:lvlJc w:val="left"/>
+      <w:pPr>
+        <w:tabs>
+          <w:tab w:val="num" w:pos="4320"/>
+        </w:tabs>
+        <w:ind w:left="4320" w:hanging="360"/>
+      </w:pPr>
+    </w:lvl>
+    <w:lvl w:ilvl="6" w:tentative="1">
+      <w:start w:val="1"/>
+      <w:numFmt w:val="decimal"/>
+      <w:lvlText w:val="%7."/>
+      <w:lvlJc w:val="left"/>
+      <w:pPr>
+        <w:tabs>
+          <w:tab w:val="num" w:pos="5040"/>
+        </w:tabs>
+        <w:ind w:left="5040" w:hanging="360"/>
+      </w:pPr>
+    </w:lvl>
+    <w:lvl w:ilvl="7" w:tentative="1">
+      <w:start w:val="1"/>
+      <w:numFmt w:val="decimal"/>
+      <w:lvlText w:val="%8."/>
+      <w:lvlJc w:val="left"/>
+      <w:pPr>
+        <w:tabs>
+          <w:tab w:val="num" w:pos="5760"/>
+        </w:tabs>
+        <w:ind w:left="5760" w:hanging="360"/>
+      </w:pPr>
+    </w:lvl>
+    <w:lvl w:ilvl="8" w:tentative="1">
+      <w:start w:val="1"/>
+      <w:numFmt w:val="decimal"/>
+      <w:lvlText w:val="%9."/>
+      <w:lvlJc w:val="left"/>
+      <w:pPr>
+        <w:tabs>
+          <w:tab w:val="num" w:pos="6480"/>
+        </w:tabs>
+        <w:ind w:left="6480" w:hanging="360"/>
+      </w:pPr>
+    </w:lvl>
+  </w:abstractNum>
+  <w:abstractNum w:abstractNumId="16" w15:restartNumberingAfterBreak="0">
     <w:nsid w:val="6B5E3CD8"/>
     <w:multiLevelType w:val="multilevel"/>
     <w:tmpl w:val="F95E1FAA"/>
@@ -4264,7 +4747,7 @@
       </w:rPr>
     </w:lvl>
   </w:abstractNum>
-  <w:abstractNum w:abstractNumId="16" w15:restartNumberingAfterBreak="0">
+  <w:abstractNum w:abstractNumId="17" w15:restartNumberingAfterBreak="0">
     <w:nsid w:val="70705130"/>
     <w:multiLevelType w:val="multilevel"/>
     <w:tmpl w:val="B478CFCE"/>
@@ -4413,7 +4896,7 @@
       </w:rPr>
     </w:lvl>
   </w:abstractNum>
-  <w:abstractNum w:abstractNumId="17" w15:restartNumberingAfterBreak="0">
+  <w:abstractNum w:abstractNumId="18" w15:restartNumberingAfterBreak="0">
     <w:nsid w:val="7B31683B"/>
     <w:multiLevelType w:val="multilevel"/>
     <w:tmpl w:val="EBB29308"/>
@@ -4575,13 +5058,13 @@
     <w:abstractNumId w:val="5"/>
   </w:num>
   <w:num w:numId="5" w16cid:durableId="522403545">
-    <w:abstractNumId w:val="15"/>
+    <w:abstractNumId w:val="16"/>
   </w:num>
   <w:num w:numId="6" w16cid:durableId="12877029">
     <w:abstractNumId w:val="4"/>
   </w:num>
   <w:num w:numId="7" w16cid:durableId="1270701178">
-    <w:abstractNumId w:val="16"/>
+    <w:abstractNumId w:val="17"/>
   </w:num>
   <w:num w:numId="8" w16cid:durableId="1440837178">
     <w:abstractNumId w:val="1"/>
@@ -4593,7 +5076,7 @@
     <w:abstractNumId w:val="6"/>
   </w:num>
   <w:num w:numId="11" w16cid:durableId="455832565">
-    <w:abstractNumId w:val="17"/>
+    <w:abstractNumId w:val="18"/>
   </w:num>
   <w:num w:numId="12" w16cid:durableId="1256088863">
     <w:abstractNumId w:val="12"/>
@@ -4615,6 +5098,9 @@
   </w:num>
   <w:num w:numId="18" w16cid:durableId="765344145">
     <w:abstractNumId w:val="3"/>
+  </w:num>
+  <w:num w:numId="19" w16cid:durableId="1359814337">
+    <w:abstractNumId w:val="15"/>
   </w:num>
 </w:numbering>
 </file>
@@ -5586,6 +6072,17 @@
       <w:u w:val="single"/>
     </w:rPr>
   </w:style>
+  <w:style w:type="paragraph" w:styleId="NormalWeb">
+    <w:name w:val="Normal (Web)"/>
+    <w:basedOn w:val="Normal"/>
+    <w:uiPriority w:val="99"/>
+    <w:semiHidden/>
+    <w:unhideWhenUsed/>
+    <w:rsid w:val="005A1887"/>
+    <w:rPr>
+      <w:rFonts w:ascii="Times New Roman" w:hAnsi="Times New Roman" w:cs="Times New Roman"/>
+    </w:rPr>
+  </w:style>
 </w:styles>
 </file>
 

</xml_diff>

<commit_message>
updated the addressed review concerns evidence in the repost document
</commit_message>
<xml_diff>
--- a/Evidence/[Validation] BasePath when one deployment answers on several path prefixes.docx
+++ b/Evidence/[Validation] BasePath when one deployment answers on several path prefixes.docx
@@ -433,7 +433,6 @@
               </w:rPr>
             </w:pPr>
             <w:proofErr w:type="spellStart"/>
-            <w:proofErr w:type="gramStart"/>
             <w:r>
               <w:rPr>
                 <w:b/>
@@ -442,7 +441,6 @@
               <w:t>S.No</w:t>
             </w:r>
             <w:proofErr w:type="spellEnd"/>
-            <w:proofErr w:type="gramEnd"/>
           </w:p>
         </w:tc>
         <w:tc>
@@ -572,15 +570,7 @@
           </w:tcPr>
           <w:p>
             <w:r>
-              <w:t xml:space="preserve">Assets </w:t>
-            </w:r>
-            <w:proofErr w:type="gramStart"/>
-            <w:r>
-              <w:t>loads</w:t>
-            </w:r>
-            <w:proofErr w:type="gramEnd"/>
-            <w:r>
-              <w:t xml:space="preserve"> Alpha</w:t>
+              <w:t>Assets loads Alpha</w:t>
             </w:r>
           </w:p>
         </w:tc>
@@ -657,15 +647,7 @@
           </w:tcPr>
           <w:p>
             <w:r>
-              <w:t xml:space="preserve">Assets </w:t>
-            </w:r>
-            <w:proofErr w:type="gramStart"/>
-            <w:r>
-              <w:t>loads</w:t>
-            </w:r>
-            <w:proofErr w:type="gramEnd"/>
-            <w:r>
-              <w:t xml:space="preserve"> beta</w:t>
+              <w:t>Assets loads beta</w:t>
             </w:r>
           </w:p>
         </w:tc>
@@ -1357,19 +1339,7 @@
                 <w:rPr>
                   <w:rStyle w:val="Hyperlink"/>
                 </w:rPr>
-                <w:t>Alpha-Form-Submi</w:t>
-              </w:r>
-              <w:r>
-                <w:rPr>
-                  <w:rStyle w:val="Hyperlink"/>
-                </w:rPr>
-                <w:t>t</w:t>
-              </w:r>
-              <w:r>
-                <w:rPr>
-                  <w:rStyle w:val="Hyperlink"/>
-                </w:rPr>
-                <w:t>-Test.png</w:t>
+                <w:t>Alpha-Form-Submit-Test.png</w:t>
               </w:r>
             </w:hyperlink>
           </w:p>
@@ -1384,13 +1354,7 @@
                 <w:rPr>
                   <w:rStyle w:val="Hyperlink"/>
                 </w:rPr>
-                <w:t>Alpha-Form-Submit-Test.pn</w:t>
-              </w:r>
-              <w:r>
-                <w:rPr>
-                  <w:rStyle w:val="Hyperlink"/>
-                </w:rPr>
-                <w:t>g</w:t>
+                <w:t>Alpha-Form-Submit-Test.png</w:t>
               </w:r>
             </w:hyperlink>
           </w:p>
@@ -1405,19 +1369,7 @@
                 <w:rPr>
                   <w:rStyle w:val="Hyperlink"/>
                 </w:rPr>
-                <w:t>Alpha-Form-Submit-T</w:t>
-              </w:r>
-              <w:r>
-                <w:rPr>
-                  <w:rStyle w:val="Hyperlink"/>
-                </w:rPr>
-                <w:t>e</w:t>
-              </w:r>
-              <w:r>
-                <w:rPr>
-                  <w:rStyle w:val="Hyperlink"/>
-                </w:rPr>
-                <w:t>st.png</w:t>
+                <w:t>Alpha-Form-Submit-Test.png</w:t>
               </w:r>
             </w:hyperlink>
           </w:p>
@@ -1489,19 +1441,7 @@
                 <w:rPr>
                   <w:rStyle w:val="Hyperlink"/>
                 </w:rPr>
-                <w:t>Beta</w:t>
-              </w:r>
-              <w:r>
-                <w:rPr>
-                  <w:rStyle w:val="Hyperlink"/>
-                </w:rPr>
-                <w:t>-</w:t>
-              </w:r>
-              <w:r>
-                <w:rPr>
-                  <w:rStyle w:val="Hyperlink"/>
-                </w:rPr>
-                <w:t>Form_Submit-Test.png</w:t>
+                <w:t>Beta-Form_Submit-Test.png</w:t>
               </w:r>
             </w:hyperlink>
           </w:p>
@@ -1516,19 +1456,7 @@
                 <w:rPr>
                   <w:rStyle w:val="Hyperlink"/>
                 </w:rPr>
-                <w:t>Beta-Fo</w:t>
-              </w:r>
-              <w:r>
-                <w:rPr>
-                  <w:rStyle w:val="Hyperlink"/>
-                </w:rPr>
-                <w:t>r</w:t>
-              </w:r>
-              <w:r>
-                <w:rPr>
-                  <w:rStyle w:val="Hyperlink"/>
-                </w:rPr>
-                <w:t>m_Submit-Test.png</w:t>
+                <w:t>Beta-Form_Submit-Test.png</w:t>
               </w:r>
             </w:hyperlink>
           </w:p>
@@ -1561,15 +1489,7 @@
           </w:tcPr>
           <w:p>
             <w:r>
-              <w:t xml:space="preserve">Adding a prefix requires no source change and no </w:t>
-            </w:r>
-            <w:proofErr w:type="gramStart"/>
-            <w:r>
-              <w:t>rebuild</w:t>
-            </w:r>
-            <w:proofErr w:type="gramEnd"/>
-            <w:r>
-              <w:t>.</w:t>
+              <w:t>Adding a prefix requires no source change and no rebuild.</w:t>
             </w:r>
           </w:p>
           <w:p/>
@@ -1871,19 +1791,7 @@
                 <w:rPr>
                   <w:rStyle w:val="Hyperlink"/>
                 </w:rPr>
-                <w:t>Both prefixes on</w:t>
-              </w:r>
-              <w:r>
-                <w:rPr>
-                  <w:rStyle w:val="Hyperlink"/>
-                </w:rPr>
-                <w:t xml:space="preserve"> </w:t>
-              </w:r>
-              <w:r>
-                <w:rPr>
-                  <w:rStyle w:val="Hyperlink"/>
-                </w:rPr>
-                <w:t>different browser.png</w:t>
+                <w:t>Both prefixes on different browser.png</w:t>
               </w:r>
             </w:hyperlink>
           </w:p>
@@ -1898,19 +1806,7 @@
                 <w:rPr>
                   <w:rStyle w:val="Hyperlink"/>
                 </w:rPr>
-                <w:t>Both prefixes on different brow</w:t>
-              </w:r>
-              <w:r>
-                <w:rPr>
-                  <w:rStyle w:val="Hyperlink"/>
-                </w:rPr>
-                <w:t>s</w:t>
-              </w:r>
-              <w:r>
-                <w:rPr>
-                  <w:rStyle w:val="Hyperlink"/>
-                </w:rPr>
-                <w:t>er.png</w:t>
+                <w:t>Both prefixes on different browser.png</w:t>
               </w:r>
             </w:hyperlink>
           </w:p>
@@ -1925,19 +1821,7 @@
                 <w:rPr>
                   <w:rStyle w:val="Hyperlink"/>
                 </w:rPr>
-                <w:t>Both prefixes on diffe</w:t>
-              </w:r>
-              <w:r>
-                <w:rPr>
-                  <w:rStyle w:val="Hyperlink"/>
-                </w:rPr>
-                <w:t>r</w:t>
-              </w:r>
-              <w:r>
-                <w:rPr>
-                  <w:rStyle w:val="Hyperlink"/>
-                </w:rPr>
-                <w:t>ent browser.png</w:t>
+                <w:t>Both prefixes on different browser.png</w:t>
               </w:r>
             </w:hyperlink>
           </w:p>
@@ -2309,6 +2193,160 @@
                   <w:rStyle w:val="Hyperlink"/>
                 </w:rPr>
                 <w:t>WASM Container Test Demo.mp4</w:t>
+              </w:r>
+            </w:hyperlink>
+          </w:p>
+        </w:tc>
+        <w:tc>
+          <w:tcPr>
+            <w:tcW w:w="1357" w:type="dxa"/>
+          </w:tcPr>
+          <w:p>
+            <w:r>
+              <w:t>Pass</w:t>
+            </w:r>
+          </w:p>
+        </w:tc>
+      </w:tr>
+      <w:tr>
+        <w:tc>
+          <w:tcPr>
+            <w:tcW w:w="535" w:type="dxa"/>
+          </w:tcPr>
+          <w:p>
+            <w:r>
+              <w:t>19</w:t>
+            </w:r>
+          </w:p>
+        </w:tc>
+        <w:tc>
+          <w:tcPr>
+            <w:tcW w:w="1890" w:type="dxa"/>
+          </w:tcPr>
+          <w:p>
+            <w:r>
+              <w:t>Container submit test alpha</w:t>
+            </w:r>
+          </w:p>
+        </w:tc>
+        <w:tc>
+          <w:tcPr>
+            <w:tcW w:w="1710" w:type="dxa"/>
+          </w:tcPr>
+          <w:p>
+            <w:hyperlink r:id="rId72" w:history="1">
+              <w:r>
+                <w:rPr>
+                  <w:rStyle w:val="Hyperlink"/>
+                </w:rPr>
+                <w:t>Container submit alpha test.png</w:t>
+              </w:r>
+            </w:hyperlink>
+          </w:p>
+        </w:tc>
+        <w:tc>
+          <w:tcPr>
+            <w:tcW w:w="2430" w:type="dxa"/>
+          </w:tcPr>
+          <w:p>
+            <w:hyperlink r:id="rId73" w:history="1">
+              <w:r>
+                <w:rPr>
+                  <w:rStyle w:val="Hyperlink"/>
+                </w:rPr>
+                <w:t>Container form submit alphatest.png</w:t>
+              </w:r>
+            </w:hyperlink>
+          </w:p>
+        </w:tc>
+        <w:tc>
+          <w:tcPr>
+            <w:tcW w:w="2153" w:type="dxa"/>
+          </w:tcPr>
+          <w:p>
+            <w:hyperlink r:id="rId74" w:history="1">
+              <w:r>
+                <w:rPr>
+                  <w:rStyle w:val="Hyperlink"/>
+                </w:rPr>
+                <w:t>Container form submit alpha test.png</w:t>
+              </w:r>
+            </w:hyperlink>
+          </w:p>
+        </w:tc>
+        <w:tc>
+          <w:tcPr>
+            <w:tcW w:w="1357" w:type="dxa"/>
+          </w:tcPr>
+          <w:p>
+            <w:r>
+              <w:t>Pass</w:t>
+            </w:r>
+          </w:p>
+        </w:tc>
+      </w:tr>
+      <w:tr>
+        <w:tc>
+          <w:tcPr>
+            <w:tcW w:w="535" w:type="dxa"/>
+          </w:tcPr>
+          <w:p>
+            <w:r>
+              <w:t>20</w:t>
+            </w:r>
+          </w:p>
+        </w:tc>
+        <w:tc>
+          <w:tcPr>
+            <w:tcW w:w="1890" w:type="dxa"/>
+          </w:tcPr>
+          <w:p>
+            <w:r>
+              <w:t>Container test beta</w:t>
+            </w:r>
+          </w:p>
+        </w:tc>
+        <w:tc>
+          <w:tcPr>
+            <w:tcW w:w="1710" w:type="dxa"/>
+          </w:tcPr>
+          <w:p>
+            <w:hyperlink r:id="rId75" w:history="1">
+              <w:r>
+                <w:rPr>
+                  <w:rStyle w:val="Hyperlink"/>
+                </w:rPr>
+                <w:t>Container submit beta test.png</w:t>
+              </w:r>
+            </w:hyperlink>
+          </w:p>
+        </w:tc>
+        <w:tc>
+          <w:tcPr>
+            <w:tcW w:w="2430" w:type="dxa"/>
+          </w:tcPr>
+          <w:p>
+            <w:hyperlink r:id="rId76" w:history="1">
+              <w:r>
+                <w:rPr>
+                  <w:rStyle w:val="Hyperlink"/>
+                </w:rPr>
+                <w:t>Container form submit beta test.png</w:t>
+              </w:r>
+            </w:hyperlink>
+          </w:p>
+        </w:tc>
+        <w:tc>
+          <w:tcPr>
+            <w:tcW w:w="2153" w:type="dxa"/>
+          </w:tcPr>
+          <w:p>
+            <w:hyperlink r:id="rId77" w:history="1">
+              <w:r>
+                <w:rPr>
+                  <w:rStyle w:val="Hyperlink"/>
+                </w:rPr>
+                <w:t>Container form submit beta test.png</w:t>
               </w:r>
             </w:hyperlink>
           </w:p>
@@ -6402,6 +6440,15 @@
 </file>
 
 <file path=customXml/item1.xml><?xml version="1.0" encoding="utf-8"?>
+<?mso-contentType ?>
+<FormTemplates xmlns="http://schemas.microsoft.com/sharepoint/v3/contenttype/forms">
+  <Display>DocumentLibraryForm</Display>
+  <Edit>DocumentLibraryForm</Edit>
+  <New>DocumentLibraryForm</New>
+</FormTemplates>
+</file>
+
+<file path=customXml/item2.xml><?xml version="1.0" encoding="utf-8"?>
 <p:properties xmlns:p="http://schemas.microsoft.com/office/2006/metadata/properties" xmlns:xsi="http://www.w3.org/2001/XMLSchema-instance" xmlns:pc="http://schemas.microsoft.com/office/infopath/2007/PartnerControls">
   <documentManagement>
     <TaxCatchAll xmlns="76301635-9239-4c63-b7c3-1485db98b457" xsi:nil="true"/>
@@ -6412,7 +6459,7 @@
 </p:properties>
 </file>
 
-<file path=customXml/item2.xml><?xml version="1.0" encoding="utf-8"?>
+<file path=customXml/item3.xml><?xml version="1.0" encoding="utf-8"?>
 <ct:contentTypeSchema xmlns:ct="http://schemas.microsoft.com/office/2006/metadata/contentType" xmlns:ma="http://schemas.microsoft.com/office/2006/metadata/properties/metaAttributes" ct:_="" ma:_="" ma:contentTypeName="Document" ma:contentTypeID="0x0101002A361625FF487C4CA3EA5191E57B8C6D" ma:contentTypeVersion="10" ma:contentTypeDescription="Create a new document." ma:contentTypeScope="" ma:versionID="460a0a69af9734aeff2026eb69990c75">
   <xsd:schema xmlns:xsd="http://www.w3.org/2001/XMLSchema" xmlns:xs="http://www.w3.org/2001/XMLSchema" xmlns:p="http://schemas.microsoft.com/office/2006/metadata/properties" xmlns:ns2="caee7eb6-6dd4-45c1-9e8a-babddf390f35" xmlns:ns3="76301635-9239-4c63-b7c3-1485db98b457" targetNamespace="http://schemas.microsoft.com/office/2006/metadata/properties" ma:root="true" ma:fieldsID="df81253d5c86e2f07a84be4452311541" ns2:_="" ns3:_="">
     <xsd:import namespace="caee7eb6-6dd4-45c1-9e8a-babddf390f35"/>
@@ -6599,16 +6646,15 @@
 </ct:contentTypeSchema>
 </file>
 
-<file path=customXml/item3.xml><?xml version="1.0" encoding="utf-8"?>
-<?mso-contentType ?>
-<FormTemplates xmlns="http://schemas.microsoft.com/sharepoint/v3/contenttype/forms">
-  <Display>DocumentLibraryForm</Display>
-  <Edit>DocumentLibraryForm</Edit>
-  <New>DocumentLibraryForm</New>
-</FormTemplates>
+<file path=customXml/itemProps1.xml><?xml version="1.0" encoding="utf-8"?>
+<ds:datastoreItem xmlns:ds="http://schemas.openxmlformats.org/officeDocument/2006/customXml" ds:itemID="{A5A7F1FD-CE26-4C6E-80B9-F7C0DA317E9C}">
+  <ds:schemaRefs>
+    <ds:schemaRef ds:uri="http://schemas.microsoft.com/sharepoint/v3/contenttype/forms"/>
+  </ds:schemaRefs>
+</ds:datastoreItem>
 </file>
 
-<file path=customXml/itemProps1.xml><?xml version="1.0" encoding="utf-8"?>
+<file path=customXml/itemProps2.xml><?xml version="1.0" encoding="utf-8"?>
 <ds:datastoreItem xmlns:ds="http://schemas.openxmlformats.org/officeDocument/2006/customXml" ds:itemID="{F5914588-E53C-4630-AC3C-554394DD0297}">
   <ds:schemaRefs>
     <ds:schemaRef ds:uri="http://schemas.microsoft.com/office/2006/metadata/properties"/>
@@ -6619,7 +6665,7 @@
 </ds:datastoreItem>
 </file>
 
-<file path=customXml/itemProps2.xml><?xml version="1.0" encoding="utf-8"?>
+<file path=customXml/itemProps3.xml><?xml version="1.0" encoding="utf-8"?>
 <ds:datastoreItem xmlns:ds="http://schemas.openxmlformats.org/officeDocument/2006/customXml" ds:itemID="{CA84680B-EADD-4150-AEDF-CAA5335595FA}">
   <ds:schemaRefs>
     <ds:schemaRef ds:uri="http://schemas.microsoft.com/office/2006/metadata/contentType"/>
@@ -6636,12 +6682,4 @@
     <ds:schemaRef ds:uri="http://schemas.microsoft.com/internal/obd"/>
   </ds:schemaRefs>
 </ds:datastoreItem>
-</file>
-
-<file path=customXml/itemProps3.xml><?xml version="1.0" encoding="utf-8"?>
-<ds:datastoreItem xmlns:ds="http://schemas.openxmlformats.org/officeDocument/2006/customXml" ds:itemID="{A5A7F1FD-CE26-4C6E-80B9-F7C0DA317E9C}">
-  <ds:schemaRefs>
-    <ds:schemaRef ds:uri="http://schemas.microsoft.com/sharepoint/v3/contenttype/forms"/>
-  </ds:schemaRefs>
-</ds:datastoreItem>
 </file>
</xml_diff>

<commit_message>
Updated the evidence for the Forwarded Host, Protocol, and Prefix Validation Evidence Alpha
</commit_message>
<xml_diff>
--- a/Evidence/[Validation] BasePath when one deployment answers on several path prefixes.docx
+++ b/Evidence/[Validation] BasePath when one deployment answers on several path prefixes.docx
@@ -433,6 +433,7 @@
               </w:rPr>
             </w:pPr>
             <w:proofErr w:type="spellStart"/>
+            <w:proofErr w:type="gramStart"/>
             <w:r>
               <w:rPr>
                 <w:b/>
@@ -441,6 +442,7 @@
               <w:t>S.No</w:t>
             </w:r>
             <w:proofErr w:type="spellEnd"/>
+            <w:proofErr w:type="gramEnd"/>
           </w:p>
         </w:tc>
         <w:tc>
@@ -570,7 +572,15 @@
           </w:tcPr>
           <w:p>
             <w:r>
-              <w:t>Assets loads Alpha</w:t>
+              <w:t xml:space="preserve">Assets </w:t>
+            </w:r>
+            <w:proofErr w:type="gramStart"/>
+            <w:r>
+              <w:t>loads</w:t>
+            </w:r>
+            <w:proofErr w:type="gramEnd"/>
+            <w:r>
+              <w:t xml:space="preserve"> Alpha</w:t>
             </w:r>
           </w:p>
         </w:tc>
@@ -647,7 +657,15 @@
           </w:tcPr>
           <w:p>
             <w:r>
-              <w:t>Assets loads beta</w:t>
+              <w:t xml:space="preserve">Assets </w:t>
+            </w:r>
+            <w:proofErr w:type="gramStart"/>
+            <w:r>
+              <w:t>loads</w:t>
+            </w:r>
+            <w:proofErr w:type="gramEnd"/>
+            <w:r>
+              <w:t xml:space="preserve"> beta</w:t>
             </w:r>
           </w:p>
         </w:tc>
@@ -1489,7 +1507,15 @@
           </w:tcPr>
           <w:p>
             <w:r>
-              <w:t>Adding a prefix requires no source change and no rebuild.</w:t>
+              <w:t xml:space="preserve">Adding a prefix requires no source change and no </w:t>
+            </w:r>
+            <w:proofErr w:type="gramStart"/>
+            <w:r>
+              <w:t>rebuild</w:t>
+            </w:r>
+            <w:proofErr w:type="gramEnd"/>
+            <w:r>
+              <w:t>.</w:t>
             </w:r>
           </w:p>
           <w:p/>
@@ -2362,11 +2388,141 @@
           </w:p>
         </w:tc>
       </w:tr>
+      <w:tr>
+        <w:tc>
+          <w:tcPr>
+            <w:tcW w:w="535" w:type="dxa"/>
+          </w:tcPr>
+          <w:p/>
+        </w:tc>
+        <w:tc>
+          <w:tcPr>
+            <w:tcW w:w="1890" w:type="dxa"/>
+          </w:tcPr>
+          <w:p>
+            <w:r>
+              <w:t>Forwarded Host, Protocol, and Prefix Validation Evidence Alpha</w:t>
+            </w:r>
+          </w:p>
+        </w:tc>
+        <w:tc>
+          <w:tcPr>
+            <w:tcW w:w="1710" w:type="dxa"/>
+          </w:tcPr>
+          <w:p>
+            <w:hyperlink r:id="rId78" w:history="1">
+              <w:r>
+                <w:rPr>
+                  <w:rStyle w:val="Hyperlink"/>
+                </w:rPr>
+                <w:t>forwarded-address-alpha.png</w:t>
+              </w:r>
+            </w:hyperlink>
+          </w:p>
+        </w:tc>
+        <w:tc>
+          <w:tcPr>
+            <w:tcW w:w="2430" w:type="dxa"/>
+          </w:tcPr>
+          <w:p>
+            <w:hyperlink r:id="rId79" w:history="1">
+              <w:r>
+                <w:rPr>
+                  <w:rStyle w:val="Hyperlink"/>
+                </w:rPr>
+                <w:t>forwarded-address-alpha.png</w:t>
+              </w:r>
+            </w:hyperlink>
+          </w:p>
+        </w:tc>
+        <w:tc>
+          <w:tcPr>
+            <w:tcW w:w="2153" w:type="dxa"/>
+          </w:tcPr>
+          <w:p>
+            <w:hyperlink r:id="rId80" w:history="1">
+              <w:r>
+                <w:rPr>
+                  <w:rStyle w:val="Hyperlink"/>
+                </w:rPr>
+                <w:t>forwarded-address-alpha.png</w:t>
+              </w:r>
+            </w:hyperlink>
+          </w:p>
+        </w:tc>
+        <w:tc>
+          <w:tcPr>
+            <w:tcW w:w="1357" w:type="dxa"/>
+          </w:tcPr>
+          <w:p/>
+        </w:tc>
+      </w:tr>
+      <w:tr>
+        <w:tc>
+          <w:tcPr>
+            <w:tcW w:w="535" w:type="dxa"/>
+          </w:tcPr>
+          <w:p/>
+        </w:tc>
+        <w:tc>
+          <w:tcPr>
+            <w:tcW w:w="1890" w:type="dxa"/>
+          </w:tcPr>
+          <w:p/>
+        </w:tc>
+        <w:tc>
+          <w:tcPr>
+            <w:tcW w:w="1710" w:type="dxa"/>
+          </w:tcPr>
+          <w:p>
+            <w:hyperlink r:id="rId81" w:history="1">
+              <w:r>
+                <w:rPr>
+                  <w:rStyle w:val="Hyperlink"/>
+                </w:rPr>
+                <w:t>forwarded-address-beta.png</w:t>
+              </w:r>
+            </w:hyperlink>
+          </w:p>
+        </w:tc>
+        <w:tc>
+          <w:tcPr>
+            <w:tcW w:w="2430" w:type="dxa"/>
+          </w:tcPr>
+          <w:p>
+            <w:hyperlink r:id="rId82" w:history="1">
+              <w:r>
+                <w:rPr>
+                  <w:rStyle w:val="Hyperlink"/>
+                </w:rPr>
+                <w:t>forwarded-address-beta.png</w:t>
+              </w:r>
+            </w:hyperlink>
+          </w:p>
+        </w:tc>
+        <w:tc>
+          <w:tcPr>
+            <w:tcW w:w="2153" w:type="dxa"/>
+          </w:tcPr>
+          <w:p>
+            <w:hyperlink r:id="rId83" w:history="1">
+              <w:r>
+                <w:rPr>
+                  <w:rStyle w:val="Hyperlink"/>
+                </w:rPr>
+                <w:t>forwarded-address-beta.png</w:t>
+              </w:r>
+            </w:hyperlink>
+          </w:p>
+        </w:tc>
+        <w:tc>
+          <w:tcPr>
+            <w:tcW w:w="1357" w:type="dxa"/>
+          </w:tcPr>
+          <w:p/>
+        </w:tc>
+      </w:tr>
     </w:tbl>
-    <w:p/>
-    <w:p/>
-    <w:p/>
-    <w:p/>
     <w:p/>
     <w:sectPr>
       <w:pgSz w:w="12240" w:h="15840"/>
@@ -6440,26 +6596,6 @@
 </file>
 
 <file path=customXml/item1.xml><?xml version="1.0" encoding="utf-8"?>
-<?mso-contentType ?>
-<FormTemplates xmlns="http://schemas.microsoft.com/sharepoint/v3/contenttype/forms">
-  <Display>DocumentLibraryForm</Display>
-  <Edit>DocumentLibraryForm</Edit>
-  <New>DocumentLibraryForm</New>
-</FormTemplates>
-</file>
-
-<file path=customXml/item2.xml><?xml version="1.0" encoding="utf-8"?>
-<p:properties xmlns:p="http://schemas.microsoft.com/office/2006/metadata/properties" xmlns:xsi="http://www.w3.org/2001/XMLSchema-instance" xmlns:pc="http://schemas.microsoft.com/office/infopath/2007/PartnerControls">
-  <documentManagement>
-    <TaxCatchAll xmlns="76301635-9239-4c63-b7c3-1485db98b457" xsi:nil="true"/>
-    <lcf76f155ced4ddcb4097134ff3c332f xmlns="caee7eb6-6dd4-45c1-9e8a-babddf390f35">
-      <Terms xmlns="http://schemas.microsoft.com/office/infopath/2007/PartnerControls"/>
-    </lcf76f155ced4ddcb4097134ff3c332f>
-  </documentManagement>
-</p:properties>
-</file>
-
-<file path=customXml/item3.xml><?xml version="1.0" encoding="utf-8"?>
 <ct:contentTypeSchema xmlns:ct="http://schemas.microsoft.com/office/2006/metadata/contentType" xmlns:ma="http://schemas.microsoft.com/office/2006/metadata/properties/metaAttributes" ct:_="" ma:_="" ma:contentTypeName="Document" ma:contentTypeID="0x0101002A361625FF487C4CA3EA5191E57B8C6D" ma:contentTypeVersion="10" ma:contentTypeDescription="Create a new document." ma:contentTypeScope="" ma:versionID="460a0a69af9734aeff2026eb69990c75">
   <xsd:schema xmlns:xsd="http://www.w3.org/2001/XMLSchema" xmlns:xs="http://www.w3.org/2001/XMLSchema" xmlns:p="http://schemas.microsoft.com/office/2006/metadata/properties" xmlns:ns2="caee7eb6-6dd4-45c1-9e8a-babddf390f35" xmlns:ns3="76301635-9239-4c63-b7c3-1485db98b457" targetNamespace="http://schemas.microsoft.com/office/2006/metadata/properties" ma:root="true" ma:fieldsID="df81253d5c86e2f07a84be4452311541" ns2:_="" ns3:_="">
     <xsd:import namespace="caee7eb6-6dd4-45c1-9e8a-babddf390f35"/>
@@ -6646,26 +6782,27 @@
 </ct:contentTypeSchema>
 </file>
 
-<file path=customXml/itemProps1.xml><?xml version="1.0" encoding="utf-8"?>
-<ds:datastoreItem xmlns:ds="http://schemas.openxmlformats.org/officeDocument/2006/customXml" ds:itemID="{A5A7F1FD-CE26-4C6E-80B9-F7C0DA317E9C}">
-  <ds:schemaRefs>
-    <ds:schemaRef ds:uri="http://schemas.microsoft.com/sharepoint/v3/contenttype/forms"/>
-  </ds:schemaRefs>
-</ds:datastoreItem>
+<file path=customXml/item2.xml><?xml version="1.0" encoding="utf-8"?>
+<?mso-contentType ?>
+<FormTemplates xmlns="http://schemas.microsoft.com/sharepoint/v3/contenttype/forms">
+  <Display>DocumentLibraryForm</Display>
+  <Edit>DocumentLibraryForm</Edit>
+  <New>DocumentLibraryForm</New>
+</FormTemplates>
 </file>
 
-<file path=customXml/itemProps2.xml><?xml version="1.0" encoding="utf-8"?>
-<ds:datastoreItem xmlns:ds="http://schemas.openxmlformats.org/officeDocument/2006/customXml" ds:itemID="{F5914588-E53C-4630-AC3C-554394DD0297}">
-  <ds:schemaRefs>
-    <ds:schemaRef ds:uri="http://schemas.microsoft.com/office/2006/metadata/properties"/>
-    <ds:schemaRef ds:uri="http://schemas.microsoft.com/office/infopath/2007/PartnerControls"/>
-    <ds:schemaRef ds:uri="76301635-9239-4c63-b7c3-1485db98b457"/>
-    <ds:schemaRef ds:uri="caee7eb6-6dd4-45c1-9e8a-babddf390f35"/>
-  </ds:schemaRefs>
-</ds:datastoreItem>
+<file path=customXml/item3.xml><?xml version="1.0" encoding="utf-8"?>
+<p:properties xmlns:p="http://schemas.microsoft.com/office/2006/metadata/properties" xmlns:xsi="http://www.w3.org/2001/XMLSchema-instance" xmlns:pc="http://schemas.microsoft.com/office/infopath/2007/PartnerControls">
+  <documentManagement>
+    <TaxCatchAll xmlns="76301635-9239-4c63-b7c3-1485db98b457" xsi:nil="true"/>
+    <lcf76f155ced4ddcb4097134ff3c332f xmlns="caee7eb6-6dd4-45c1-9e8a-babddf390f35">
+      <Terms xmlns="http://schemas.microsoft.com/office/infopath/2007/PartnerControls"/>
+    </lcf76f155ced4ddcb4097134ff3c332f>
+  </documentManagement>
+</p:properties>
 </file>
 
-<file path=customXml/itemProps3.xml><?xml version="1.0" encoding="utf-8"?>
+<file path=customXml/itemProps1.xml><?xml version="1.0" encoding="utf-8"?>
 <ds:datastoreItem xmlns:ds="http://schemas.openxmlformats.org/officeDocument/2006/customXml" ds:itemID="{CA84680B-EADD-4150-AEDF-CAA5335595FA}">
   <ds:schemaRefs>
     <ds:schemaRef ds:uri="http://schemas.microsoft.com/office/2006/metadata/contentType"/>
@@ -6682,4 +6819,23 @@
     <ds:schemaRef ds:uri="http://schemas.microsoft.com/internal/obd"/>
   </ds:schemaRefs>
 </ds:datastoreItem>
+</file>
+
+<file path=customXml/itemProps2.xml><?xml version="1.0" encoding="utf-8"?>
+<ds:datastoreItem xmlns:ds="http://schemas.openxmlformats.org/officeDocument/2006/customXml" ds:itemID="{A5A7F1FD-CE26-4C6E-80B9-F7C0DA317E9C}">
+  <ds:schemaRefs>
+    <ds:schemaRef ds:uri="http://schemas.microsoft.com/sharepoint/v3/contenttype/forms"/>
+  </ds:schemaRefs>
+</ds:datastoreItem>
+</file>
+
+<file path=customXml/itemProps3.xml><?xml version="1.0" encoding="utf-8"?>
+<ds:datastoreItem xmlns:ds="http://schemas.openxmlformats.org/officeDocument/2006/customXml" ds:itemID="{F5914588-E53C-4630-AC3C-554394DD0297}">
+  <ds:schemaRefs>
+    <ds:schemaRef ds:uri="http://schemas.microsoft.com/office/2006/metadata/properties"/>
+    <ds:schemaRef ds:uri="http://schemas.microsoft.com/office/infopath/2007/PartnerControls"/>
+    <ds:schemaRef ds:uri="76301635-9239-4c63-b7c3-1485db98b457"/>
+    <ds:schemaRef ds:uri="caee7eb6-6dd4-45c1-9e8a-babddf390f35"/>
+  </ds:schemaRefs>
+</ds:datastoreItem>
 </file>
</xml_diff>